<commit_message>
Restructure report in assignment order
</commit_message>
<xml_diff>
--- a/docs/三体问题数值计算汇报.docx
+++ b/docs/三体问题数值计算汇报.docx
@@ -30,10 +30,25 @@
       </w:pPr>
       <w:r>
         <w:rPr>
-          <w:rFonts w:hint="eastAsia"/>
-          <w:lang w:val="en-US" w:eastAsia="zh-CN"/>
-        </w:rPr>
-        <w:t>张志杨 工程力学 强基班3024201037</w:t>
+          <w:rFonts w:ascii="楷体_GB2312" w:hAnsi="楷体_GB2312" w:eastAsia="楷体_GB2312"/>
+          <w:b w:val="0"/>
+          <w:sz w:val="24"/>
+        </w:rPr>
+        <w:t>张志杨</w:t>
+      </w:r>
+    </w:p>
+    <w:p>
+      <w:pPr>
+        <w:spacing w:before="0" w:after="0"/>
+        <w:jc w:val="center"/>
+      </w:pPr>
+      <w:r>
+        <w:rPr>
+          <w:rFonts w:ascii="Times New Roman" w:hAnsi="Times New Roman" w:eastAsia="宋体"/>
+          <w:b w:val="0"/>
+          <w:sz w:val="21"/>
+        </w:rPr>
+        <w:t>（天津大学机械工程学院；工程力学强基班；学号 3024201037）</w:t>
       </w:r>
     </w:p>
     <w:p>
@@ -88,6 +103,35 @@
           <w:sz w:val="28"/>
         </w:rPr>
         <w:t>Reproduction of the Figure Eight Orbit</w:t>
+      </w:r>
+    </w:p>
+    <w:p>
+      <w:pPr>
+        <w:spacing w:before="0" w:after="0"/>
+        <w:jc w:val="center"/>
+      </w:pPr>
+      <w:r>
+        <w:rPr>
+          <w:rFonts w:ascii="Times New Roman" w:hAnsi="Times New Roman" w:eastAsia="宋体"/>
+          <w:b w:val="0"/>
+          <w:sz w:val="21"/>
+        </w:rPr>
+        <w:t>ZHANG Zhiyang</w:t>
+      </w:r>
+    </w:p>
+    <w:p>
+      <w:pPr>
+        <w:spacing w:before="0" w:after="0"/>
+        <w:jc w:val="center"/>
+      </w:pPr>
+      <w:r>
+        <w:rPr>
+          <w:rFonts w:ascii="Times New Roman" w:hAnsi="Times New Roman" w:eastAsia="宋体"/>
+          <w:b w:val="0"/>
+          <w:i/>
+          <w:sz w:val="21"/>
+        </w:rPr>
+        <w:t>(School of Mechanical Engineering, Tianjin University; Engineering Mechanics; Student ID 3024201037)</w:t>
       </w:r>
     </w:p>
     <w:p>
@@ -286,11 +330,11 @@
       </w:pPr>
       <w:r>
         <w:rPr>
-          <w:rFonts w:ascii="Times New Roman" w:hAnsi="Times New Roman" w:eastAsia="黑体"/>
+          <w:rFonts w:ascii="Times New Roman" w:hAnsi="Times New Roman" w:eastAsia="宋体"/>
           <w:b/>
           <w:sz w:val="21"/>
         </w:rPr>
-        <w:t>1.1  无量纲模型与初值</w:t>
+        <w:t>1.1  无量纲模型</w:t>
       </w:r>
     </w:p>
     <w:p>
@@ -606,580 +650,12 @@
       <w:r>
         <w:rPr>
           <w:rFonts w:ascii="Times New Roman" w:hAnsi="Times New Roman" w:eastAsia="宋体"/>
-          <w:sz w:val="24"/>
-        </w:rPr>
-        <w:t>两体距离趋于零时原方程奇异。本次给定时间区间内均未发生碰撞，结论不延伸到未计算时段。表 1-1 列出基本算例；位置与速度均按物体编号列出。</w:t>
-      </w:r>
-    </w:p>
-    <w:p>
-      <w:pPr>
-        <w:pStyle w:val="4"/>
-        <w:keepNext/>
-        <w:spacing w:before="400" w:after="0" w:line="240" w:lineRule="auto"/>
-        <w:ind w:firstLine="0"/>
-        <w:jc w:val="center"/>
-      </w:pPr>
-      <w:r>
-        <w:rPr>
-          <w:rFonts w:ascii="Times New Roman" w:hAnsi="Times New Roman" w:eastAsia="宋体"/>
-          <w:sz w:val="21"/>
-        </w:rPr>
-        <w:t>表1-1  基本算例的无量纲初值与时段</w:t>
-      </w:r>
-    </w:p>
-    <w:tbl>
-      <w:tblPr>
-        <w:tblStyle w:val="7"/>
-        <w:tblW w:w="0" w:type="auto"/>
-        <w:jc w:val="center"/>
-        <w:tblBorders>
-          <w:top w:val="single" w:color="auto" w:sz="8" w:space="0"/>
-          <w:left w:val="none" w:color="auto" w:sz="8" w:space="0"/>
-          <w:bottom w:val="single" w:color="auto" w:sz="8" w:space="0"/>
-          <w:right w:val="none" w:color="auto" w:sz="8" w:space="0"/>
-          <w:insideH w:val="none" w:color="auto" w:sz="8" w:space="0"/>
-          <w:insideV w:val="none" w:color="auto" w:sz="8" w:space="0"/>
-        </w:tblBorders>
-        <w:tblLayout w:type="fixed"/>
-        <w:tblCellMar>
-          <w:top w:w="0" w:type="dxa"/>
-          <w:left w:w="10" w:type="dxa"/>
-          <w:bottom w:w="0" w:type="dxa"/>
-          <w:right w:w="10" w:type="dxa"/>
-        </w:tblCellMar>
-      </w:tblPr>
-      <w:tblGrid>
-        <w:gridCol w:w="1661"/>
-        <w:gridCol w:w="1661"/>
-        <w:gridCol w:w="1661"/>
-        <w:gridCol w:w="1661"/>
-        <w:gridCol w:w="1661"/>
-      </w:tblGrid>
-      <w:tr>
-        <w:trPr>
-          <w:cantSplit/>
-          <w:tblHeader/>
-          <w:jc w:val="center"/>
-        </w:trPr>
-        <w:tc>
-          <w:tcPr>
-            <w:tcW w:w="1661" w:type="dxa"/>
-            <w:tcBorders>
-              <w:bottom w:val="single" w:color="auto" w:sz="4" w:space="0"/>
-            </w:tcBorders>
-            <w:vAlign w:val="center"/>
-          </w:tcPr>
-          <w:p>
-            <w:pPr>
-              <w:keepNext/>
-              <w:spacing w:before="80" w:after="80" w:line="240" w:lineRule="auto"/>
-              <w:jc w:val="center"/>
-            </w:pPr>
-            <w:r>
-              <w:rPr>
-                <w:rFonts w:ascii="Times New Roman" w:hAnsi="Times New Roman" w:eastAsia="宋体"/>
-                <w:b/>
-                <w:sz w:val="21"/>
-              </w:rPr>
-              <w:t>算例</w:t>
-            </w:r>
-          </w:p>
-        </w:tc>
-        <w:tc>
-          <w:tcPr>
-            <w:tcW w:w="1661" w:type="dxa"/>
-            <w:tcBorders>
-              <w:bottom w:val="single" w:color="auto" w:sz="4" w:space="0"/>
-            </w:tcBorders>
-            <w:vAlign w:val="center"/>
-          </w:tcPr>
-          <w:p>
-            <w:pPr>
-              <w:keepNext/>
-              <w:spacing w:before="80" w:after="80" w:line="240" w:lineRule="auto"/>
-              <w:jc w:val="center"/>
-            </w:pPr>
-            <w:r>
-              <w:rPr>
-                <w:rFonts w:ascii="Times New Roman" w:hAnsi="Times New Roman" w:eastAsia="宋体"/>
-                <w:b/>
-                <w:sz w:val="21"/>
-              </w:rPr>
-              <w:t>质量</w:t>
-            </w:r>
-          </w:p>
-        </w:tc>
-        <w:tc>
-          <w:tcPr>
-            <w:tcW w:w="1661" w:type="dxa"/>
-            <w:tcBorders>
-              <w:bottom w:val="single" w:color="auto" w:sz="4" w:space="0"/>
-            </w:tcBorders>
-            <w:vAlign w:val="center"/>
-          </w:tcPr>
-          <w:p>
-            <w:pPr>
-              <w:keepNext/>
-              <w:spacing w:before="80" w:after="80" w:line="240" w:lineRule="auto"/>
-              <w:jc w:val="center"/>
-            </w:pPr>
-            <w:r>
-              <w:rPr>
-                <w:rFonts w:ascii="Times New Roman" w:hAnsi="Times New Roman" w:eastAsia="宋体"/>
-                <w:b/>
-                <w:sz w:val="21"/>
-              </w:rPr>
-              <w:t>初始位置</w:t>
-            </w:r>
-          </w:p>
-        </w:tc>
-        <w:tc>
-          <w:tcPr>
-            <w:tcW w:w="1661" w:type="dxa"/>
-            <w:tcBorders>
-              <w:bottom w:val="single" w:color="auto" w:sz="4" w:space="0"/>
-            </w:tcBorders>
-            <w:vAlign w:val="center"/>
-          </w:tcPr>
-          <w:p>
-            <w:pPr>
-              <w:keepNext/>
-              <w:spacing w:before="80" w:after="80" w:line="240" w:lineRule="auto"/>
-              <w:jc w:val="center"/>
-            </w:pPr>
-            <w:r>
-              <w:rPr>
-                <w:rFonts w:ascii="Times New Roman" w:hAnsi="Times New Roman" w:eastAsia="宋体"/>
-                <w:b/>
-                <w:sz w:val="21"/>
-              </w:rPr>
-              <w:t>初始速度</w:t>
-            </w:r>
-          </w:p>
-        </w:tc>
-        <w:tc>
-          <w:tcPr>
-            <w:tcW w:w="1661" w:type="dxa"/>
-            <w:tcBorders>
-              <w:bottom w:val="single" w:color="auto" w:sz="4" w:space="0"/>
-            </w:tcBorders>
-            <w:vAlign w:val="center"/>
-          </w:tcPr>
-          <w:p>
-            <w:pPr>
-              <w:keepNext/>
-              <w:spacing w:before="80" w:after="80" w:line="240" w:lineRule="auto"/>
-              <w:jc w:val="center"/>
-            </w:pPr>
-            <w:r>
-              <w:rPr>
-                <w:rFonts w:ascii="Times New Roman" w:hAnsi="Times New Roman" w:eastAsia="宋体"/>
-                <w:b/>
-                <w:sz w:val="21"/>
-              </w:rPr>
-              <w:t>终止时间</w:t>
-            </w:r>
-          </w:p>
-        </w:tc>
-      </w:tr>
-      <w:tr>
-        <w:trPr>
-          <w:cantSplit/>
-          <w:jc w:val="center"/>
-        </w:trPr>
-        <w:tc>
-          <w:tcPr>
-            <w:tcW w:w="1661" w:type="dxa"/>
-            <w:vAlign w:val="center"/>
-          </w:tcPr>
-          <w:p>
-            <w:pPr>
-              <w:keepNext/>
-              <w:spacing w:before="80" w:after="80" w:line="240" w:lineRule="auto"/>
-              <w:jc w:val="center"/>
-            </w:pPr>
-            <w:r>
-              <w:rPr>
-                <w:rFonts w:ascii="Times New Roman" w:hAnsi="Times New Roman" w:eastAsia="宋体"/>
-                <w:b w:val="0"/>
-                <w:sz w:val="21"/>
-              </w:rPr>
-              <w:t>单体</w:t>
-            </w:r>
-          </w:p>
-        </w:tc>
-        <w:tc>
-          <w:tcPr>
-            <w:tcW w:w="1661" w:type="dxa"/>
-            <w:vAlign w:val="center"/>
-          </w:tcPr>
-          <w:p>
-            <w:pPr>
-              <w:keepNext/>
-              <w:spacing w:before="80" w:after="80" w:line="240" w:lineRule="auto"/>
-              <w:jc w:val="center"/>
-            </w:pPr>
-            <w:r>
-              <w:rPr>
-                <w:rFonts w:ascii="Times New Roman" w:hAnsi="Times New Roman" w:eastAsia="宋体"/>
-                <w:b w:val="0"/>
-                <w:sz w:val="21"/>
-              </w:rPr>
-              <w:t>中心 M=1</w:t>
-            </w:r>
-          </w:p>
-        </w:tc>
-        <w:tc>
-          <w:tcPr>
-            <w:tcW w:w="1661" w:type="dxa"/>
-            <w:vAlign w:val="center"/>
-          </w:tcPr>
-          <w:p>
-            <w:pPr>
-              <w:keepNext/>
-              <w:spacing w:before="80" w:after="80" w:line="240" w:lineRule="auto"/>
-              <w:jc w:val="center"/>
-            </w:pPr>
-            <w:r>
-              <w:rPr>
-                <w:rFonts w:ascii="Times New Roman" w:hAnsi="Times New Roman" w:eastAsia="宋体"/>
-                <w:b w:val="0"/>
-                <w:sz w:val="21"/>
-              </w:rPr>
-              <w:t>(0, 2)</w:t>
-            </w:r>
-          </w:p>
-        </w:tc>
-        <w:tc>
-          <w:tcPr>
-            <w:tcW w:w="1661" w:type="dxa"/>
-            <w:vAlign w:val="center"/>
-          </w:tcPr>
-          <w:p>
-            <w:pPr>
-              <w:keepNext/>
-              <w:spacing w:before="80" w:after="80" w:line="240" w:lineRule="auto"/>
-              <w:jc w:val="center"/>
-            </w:pPr>
-            <w:r>
-              <w:rPr>
-                <w:rFonts w:ascii="Times New Roman" w:hAnsi="Times New Roman" w:eastAsia="宋体"/>
-                <w:b w:val="0"/>
-                <w:sz w:val="21"/>
-              </w:rPr>
-              <w:t>(1, 0)</w:t>
-            </w:r>
-          </w:p>
-        </w:tc>
-        <w:tc>
-          <w:tcPr>
-            <w:tcW w:w="1661" w:type="dxa"/>
-            <w:vAlign w:val="center"/>
-          </w:tcPr>
-          <w:p>
-            <w:pPr>
-              <w:keepNext/>
-              <w:spacing w:before="80" w:after="80" w:line="240" w:lineRule="auto"/>
-              <w:jc w:val="center"/>
-            </w:pPr>
-            <w:r>
-              <w:rPr>
-                <w:rFonts w:ascii="Times New Roman" w:hAnsi="Times New Roman" w:eastAsia="宋体"/>
-                <w:b w:val="0"/>
-                <w:sz w:val="21"/>
-              </w:rPr>
-              <w:t>50</w:t>
-            </w:r>
-          </w:p>
-        </w:tc>
-      </w:tr>
-      <w:tr>
-        <w:trPr>
-          <w:cantSplit/>
-          <w:jc w:val="center"/>
-        </w:trPr>
-        <w:tc>
-          <w:tcPr>
-            <w:tcW w:w="1661" w:type="dxa"/>
-            <w:vAlign w:val="center"/>
-          </w:tcPr>
-          <w:p>
-            <w:pPr>
-              <w:keepNext/>
-              <w:spacing w:before="80" w:after="80" w:line="240" w:lineRule="auto"/>
-              <w:jc w:val="center"/>
-            </w:pPr>
-            <w:r>
-              <w:rPr>
-                <w:rFonts w:ascii="Times New Roman" w:hAnsi="Times New Roman" w:eastAsia="宋体"/>
-                <w:b w:val="0"/>
-                <w:sz w:val="21"/>
-              </w:rPr>
-              <w:t>二体</w:t>
-            </w:r>
-          </w:p>
-        </w:tc>
-        <w:tc>
-          <w:tcPr>
-            <w:tcW w:w="1661" w:type="dxa"/>
-            <w:vAlign w:val="center"/>
-          </w:tcPr>
-          <w:p>
-            <w:pPr>
-              <w:keepNext/>
-              <w:spacing w:before="80" w:after="80" w:line="240" w:lineRule="auto"/>
-              <w:jc w:val="center"/>
-            </w:pPr>
-            <w:r>
-              <w:rPr>
-                <w:rFonts w:ascii="Times New Roman" w:hAnsi="Times New Roman" w:eastAsia="宋体"/>
-                <w:b w:val="0"/>
-                <w:sz w:val="21"/>
-              </w:rPr>
-              <w:t>0.3；0.03</w:t>
-            </w:r>
-          </w:p>
-        </w:tc>
-        <w:tc>
-          <w:tcPr>
-            <w:tcW w:w="1661" w:type="dxa"/>
-            <w:vAlign w:val="center"/>
-          </w:tcPr>
-          <w:p>
-            <w:pPr>
-              <w:keepNext/>
-              <w:spacing w:before="80" w:after="80" w:line="240" w:lineRule="auto"/>
-              <w:jc w:val="center"/>
-            </w:pPr>
-            <w:r>
-              <w:rPr>
-                <w:rFonts w:ascii="Times New Roman" w:hAnsi="Times New Roman" w:eastAsia="宋体"/>
-                <w:b w:val="0"/>
-                <w:sz w:val="21"/>
-              </w:rPr>
-              <w:t>(2, 2)；</w:t>
-            </w:r>
-            <w:r>
-              <w:rPr>
-                <w:rFonts w:ascii="Times New Roman" w:hAnsi="Times New Roman" w:eastAsia="宋体"/>
-                <w:b w:val="0"/>
-                <w:sz w:val="21"/>
-              </w:rPr>
-              <w:br w:type="textWrapping"/>
-            </w:r>
-            <w:r>
-              <w:rPr>
-                <w:rFonts w:ascii="Times New Roman" w:hAnsi="Times New Roman" w:eastAsia="宋体"/>
-                <w:b w:val="0"/>
-                <w:sz w:val="21"/>
-              </w:rPr>
-              <w:t>(0, 0)</w:t>
-            </w:r>
-          </w:p>
-        </w:tc>
-        <w:tc>
-          <w:tcPr>
-            <w:tcW w:w="1661" w:type="dxa"/>
-            <w:vAlign w:val="center"/>
-          </w:tcPr>
-          <w:p>
-            <w:pPr>
-              <w:keepNext/>
-              <w:spacing w:before="80" w:after="80" w:line="240" w:lineRule="auto"/>
-              <w:jc w:val="center"/>
-            </w:pPr>
-            <w:r>
-              <w:rPr>
-                <w:rFonts w:ascii="Times New Roman" w:hAnsi="Times New Roman" w:eastAsia="宋体"/>
-                <w:b w:val="0"/>
-                <w:sz w:val="21"/>
-              </w:rPr>
-              <w:t>(0.2, −0.2)；</w:t>
-            </w:r>
-            <w:r>
-              <w:rPr>
-                <w:rFonts w:ascii="Times New Roman" w:hAnsi="Times New Roman" w:eastAsia="宋体"/>
-                <w:b w:val="0"/>
-                <w:sz w:val="21"/>
-              </w:rPr>
-              <w:br w:type="textWrapping"/>
-            </w:r>
-            <w:r>
-              <w:rPr>
-                <w:rFonts w:ascii="Times New Roman" w:hAnsi="Times New Roman" w:eastAsia="宋体"/>
-                <w:b w:val="0"/>
-                <w:sz w:val="21"/>
-              </w:rPr>
-              <w:t>(−0.01, 0.01)</w:t>
-            </w:r>
-          </w:p>
-        </w:tc>
-        <w:tc>
-          <w:tcPr>
-            <w:tcW w:w="1661" w:type="dxa"/>
-            <w:vAlign w:val="center"/>
-          </w:tcPr>
-          <w:p>
-            <w:pPr>
-              <w:keepNext/>
-              <w:spacing w:before="80" w:after="80" w:line="240" w:lineRule="auto"/>
-              <w:jc w:val="center"/>
-            </w:pPr>
-            <w:r>
-              <w:rPr>
-                <w:rFonts w:ascii="Times New Roman" w:hAnsi="Times New Roman" w:eastAsia="宋体"/>
-                <w:b w:val="0"/>
-                <w:sz w:val="21"/>
-              </w:rPr>
-              <w:t>20</w:t>
-            </w:r>
-          </w:p>
-        </w:tc>
-      </w:tr>
-      <w:tr>
-        <w:trPr>
-          <w:cantSplit/>
-          <w:jc w:val="center"/>
-        </w:trPr>
-        <w:tc>
-          <w:tcPr>
-            <w:tcW w:w="1661" w:type="dxa"/>
-            <w:vAlign w:val="center"/>
-          </w:tcPr>
-          <w:p>
-            <w:pPr>
-              <w:keepNext w:val="0"/>
-              <w:spacing w:before="80" w:after="80" w:line="240" w:lineRule="auto"/>
-              <w:jc w:val="center"/>
-            </w:pPr>
-            <w:r>
-              <w:rPr>
-                <w:rFonts w:ascii="Times New Roman" w:hAnsi="Times New Roman" w:eastAsia="宋体"/>
-                <w:b w:val="0"/>
-                <w:sz w:val="21"/>
-              </w:rPr>
-              <w:t>三体</w:t>
-            </w:r>
-          </w:p>
-        </w:tc>
-        <w:tc>
-          <w:tcPr>
-            <w:tcW w:w="1661" w:type="dxa"/>
-            <w:vAlign w:val="center"/>
-          </w:tcPr>
-          <w:p>
-            <w:pPr>
-              <w:keepNext w:val="0"/>
-              <w:spacing w:before="80" w:after="80" w:line="240" w:lineRule="auto"/>
-              <w:jc w:val="center"/>
-            </w:pPr>
-            <w:r>
-              <w:rPr>
-                <w:rFonts w:ascii="Times New Roman" w:hAnsi="Times New Roman" w:eastAsia="宋体"/>
-                <w:b w:val="0"/>
-                <w:sz w:val="21"/>
-              </w:rPr>
-              <w:t>0.3；0.03；0.03</w:t>
-            </w:r>
-          </w:p>
-        </w:tc>
-        <w:tc>
-          <w:tcPr>
-            <w:tcW w:w="1661" w:type="dxa"/>
-            <w:vAlign w:val="center"/>
-          </w:tcPr>
-          <w:p>
-            <w:pPr>
-              <w:keepNext w:val="0"/>
-              <w:spacing w:before="80" w:after="80" w:line="240" w:lineRule="auto"/>
-              <w:jc w:val="center"/>
-            </w:pPr>
-            <w:r>
-              <w:rPr>
-                <w:rFonts w:ascii="Times New Roman" w:hAnsi="Times New Roman" w:eastAsia="宋体"/>
-                <w:b w:val="0"/>
-                <w:sz w:val="21"/>
-              </w:rPr>
-              <w:t>(2, 2)；(0, 0)；</w:t>
-            </w:r>
-            <w:r>
-              <w:rPr>
-                <w:rFonts w:ascii="Times New Roman" w:hAnsi="Times New Roman" w:eastAsia="宋体"/>
-                <w:b w:val="0"/>
-                <w:sz w:val="21"/>
-              </w:rPr>
-              <w:br w:type="textWrapping"/>
-            </w:r>
-            <w:r>
-              <w:rPr>
-                <w:rFonts w:ascii="Times New Roman" w:hAnsi="Times New Roman" w:eastAsia="宋体"/>
-                <w:b w:val="0"/>
-                <w:sz w:val="21"/>
-              </w:rPr>
-              <w:t>(−2, −2)</w:t>
-            </w:r>
-          </w:p>
-        </w:tc>
-        <w:tc>
-          <w:tcPr>
-            <w:tcW w:w="1661" w:type="dxa"/>
-            <w:vAlign w:val="center"/>
-          </w:tcPr>
-          <w:p>
-            <w:pPr>
-              <w:keepNext w:val="0"/>
-              <w:spacing w:before="80" w:after="80" w:line="240" w:lineRule="auto"/>
-              <w:jc w:val="center"/>
-            </w:pPr>
-            <w:r>
-              <w:rPr>
-                <w:rFonts w:ascii="Times New Roman" w:hAnsi="Times New Roman" w:eastAsia="宋体"/>
-                <w:b w:val="0"/>
-                <w:sz w:val="21"/>
-              </w:rPr>
-              <w:t>(0.2, −0.2)；</w:t>
-            </w:r>
-            <w:r>
-              <w:rPr>
-                <w:rFonts w:ascii="Times New Roman" w:hAnsi="Times New Roman" w:eastAsia="宋体"/>
-                <w:b w:val="0"/>
-                <w:sz w:val="21"/>
-              </w:rPr>
-              <w:br w:type="textWrapping"/>
-            </w:r>
-            <w:r>
-              <w:rPr>
-                <w:rFonts w:ascii="Times New Roman" w:hAnsi="Times New Roman" w:eastAsia="宋体"/>
-                <w:b w:val="0"/>
-                <w:sz w:val="21"/>
-              </w:rPr>
-              <w:t>(0, 0)；(−0.2, 0.2)</w:t>
-            </w:r>
-          </w:p>
-        </w:tc>
-        <w:tc>
-          <w:tcPr>
-            <w:tcW w:w="1661" w:type="dxa"/>
-            <w:vAlign w:val="center"/>
-          </w:tcPr>
-          <w:p>
-            <w:pPr>
-              <w:keepNext w:val="0"/>
-              <w:spacing w:before="80" w:after="80" w:line="240" w:lineRule="auto"/>
-              <w:jc w:val="center"/>
-            </w:pPr>
-            <w:r>
-              <w:rPr>
-                <w:rFonts w:ascii="Times New Roman" w:hAnsi="Times New Roman" w:eastAsia="宋体"/>
-                <w:b w:val="0"/>
-                <w:sz w:val="21"/>
-              </w:rPr>
-              <w:t>30</w:t>
-            </w:r>
-          </w:p>
-        </w:tc>
-      </w:tr>
-    </w:tbl>
+          <w:b w:val="0"/>
+          <w:sz w:val="24"/>
+        </w:rPr>
+        <w:t>两体距离趋于零时原方程奇异。本次给定时间区间内均未发生碰撞，结论不延伸到未计算时段。各算例初值、时间区间及检验结果在相应小节给出。</w:t>
+      </w:r>
+    </w:p>
     <w:p>
       <w:pPr>
         <w:spacing w:before="0" w:after="0" w:line="200" w:lineRule="exact"/>
@@ -1325,6 +801,7 @@
     </w:p>
     <w:p>
       <w:pPr>
+        <w:keepNext/>
         <w:widowControl w:val="0"/>
         <w:pBdr>
           <w:top w:val="none" w:color="auto" w:sz="0" w:space="1"/>
@@ -1347,307 +824,285 @@
         <w:t>伪代码1  RK4 轨道积分</w:t>
       </w:r>
     </w:p>
-    <w:p>
-      <w:pPr>
-        <w:pBdr>
-          <w:top w:val="single" w:color="000000" w:sz="8" w:space="0"/>
-          <w:left w:val="none" w:color="auto" w:sz="0" w:space="0"/>
-          <w:bottom w:val="single" w:color="000000" w:sz="8" w:space="0"/>
-          <w:right w:val="none" w:color="auto" w:sz="0" w:space="0"/>
-        </w:pBdr>
-        <w:spacing w:before="0" w:after="0" w:line="300" w:lineRule="exact"/>
-        <w:ind w:firstLine="0"/>
-        <w:rPr>
-          <w:i/>
-          <w:iCs/>
-        </w:rPr>
-      </w:pPr>
-      <w:r>
-        <w:rPr>
-          <w:rFonts w:ascii="Times New Roman" w:hAnsi="Times New Roman" w:eastAsia="宋体"/>
-          <w:i/>
-          <w:iCs/>
-          <w:sz w:val="21"/>
-        </w:rPr>
-        <w:t>输入</w:t>
-      </w:r>
-      <w:bookmarkStart w:id="0" w:name="_GoBack"/>
-      <w:bookmarkEnd w:id="0"/>
-      <w:r>
-        <w:rPr>
-          <w:rFonts w:ascii="Times New Roman" w:hAnsi="Times New Roman" w:eastAsia="宋体"/>
-          <w:i/>
-          <w:iCs/>
-          <w:sz w:val="21"/>
-        </w:rPr>
-        <w:t>：质量数组 m，初始状态 z₀，终止时间 T，最大步长 h。</w:t>
-      </w:r>
-    </w:p>
-    <w:p>
-      <w:pPr>
-        <w:pBdr>
-          <w:top w:val="none" w:color="000000" w:sz="0" w:space="0"/>
-          <w:left w:val="none" w:color="auto" w:sz="0" w:space="0"/>
-          <w:bottom w:val="none" w:color="000000" w:sz="0" w:space="0"/>
-          <w:right w:val="none" w:color="auto" w:sz="0" w:space="0"/>
-        </w:pBdr>
-        <w:spacing w:before="0" w:after="0" w:line="300" w:lineRule="exact"/>
-        <w:ind w:firstLine="0"/>
-        <w:rPr>
-          <w:i/>
-          <w:iCs/>
-        </w:rPr>
-      </w:pPr>
-      <w:r>
-        <w:rPr>
-          <w:rFonts w:ascii="Times New Roman" w:hAnsi="Times New Roman" w:eastAsia="宋体"/>
-          <w:i/>
-          <w:iCs/>
-          <w:sz w:val="21"/>
-        </w:rPr>
-        <w:t>初始化：t ← 0，z ← z₀；保存初始状态。</w:t>
-      </w:r>
-    </w:p>
-    <w:p>
-      <w:pPr>
-        <w:pBdr>
-          <w:top w:val="single" w:color="000000" w:sz="8" w:space="0"/>
-          <w:left w:val="none" w:color="auto" w:sz="0" w:space="0"/>
-          <w:bottom w:val="single" w:color="000000" w:sz="8" w:space="0"/>
-          <w:right w:val="none" w:color="auto" w:sz="0" w:space="0"/>
-        </w:pBdr>
-        <w:spacing w:before="0" w:after="0" w:line="300" w:lineRule="exact"/>
-        <w:ind w:firstLine="0"/>
-        <w:rPr>
-          <w:i/>
-          <w:iCs/>
-        </w:rPr>
-      </w:pPr>
-      <w:r>
-        <w:rPr>
-          <w:rFonts w:ascii="Times New Roman" w:hAnsi="Times New Roman" w:eastAsia="宋体"/>
-          <w:i/>
-          <w:iCs/>
-          <w:sz w:val="21"/>
-        </w:rPr>
-        <w:t>当 t &lt; T 时：</w:t>
-      </w:r>
-    </w:p>
-    <w:p>
-      <w:pPr>
-        <w:pBdr>
-          <w:top w:val="single" w:color="000000" w:sz="8" w:space="0"/>
-          <w:left w:val="none" w:color="auto" w:sz="0" w:space="0"/>
-          <w:bottom w:val="single" w:color="000000" w:sz="8" w:space="0"/>
-          <w:right w:val="none" w:color="auto" w:sz="0" w:space="0"/>
-        </w:pBdr>
-        <w:spacing w:before="0" w:after="0" w:line="300" w:lineRule="exact"/>
-        <w:ind w:firstLine="420" w:firstLineChars="0"/>
-        <w:rPr>
-          <w:i/>
-          <w:iCs/>
-        </w:rPr>
-      </w:pPr>
-      <w:r>
-        <w:rPr>
-          <w:rFonts w:ascii="Times New Roman" w:hAnsi="Times New Roman" w:eastAsia="宋体"/>
-          <w:i/>
-          <w:iCs/>
-          <w:sz w:val="21"/>
-        </w:rPr>
-        <w:t>Δt ← min(h, T − t)。</w:t>
-      </w:r>
-    </w:p>
-    <w:p>
-      <w:pPr>
-        <w:pBdr>
-          <w:top w:val="single" w:color="000000" w:sz="8" w:space="0"/>
-          <w:left w:val="none" w:color="auto" w:sz="0" w:space="0"/>
-          <w:bottom w:val="single" w:color="000000" w:sz="8" w:space="0"/>
-          <w:right w:val="none" w:color="auto" w:sz="0" w:space="0"/>
-        </w:pBdr>
-        <w:spacing w:before="0" w:after="0" w:line="300" w:lineRule="exact"/>
-        <w:ind w:firstLine="420" w:firstLineChars="0"/>
-        <w:rPr>
-          <w:i/>
-          <w:iCs/>
-        </w:rPr>
-      </w:pPr>
-      <w:r>
-        <w:rPr>
-          <w:rFonts w:ascii="Times New Roman" w:hAnsi="Times New Roman" w:eastAsia="宋体"/>
-          <w:i/>
-          <w:iCs/>
-          <w:sz w:val="21"/>
-        </w:rPr>
-        <w:t>k₁ ← f(z, t)；k₂ ← f(z + Δt k₁/2, t + Δt/2)。</w:t>
-      </w:r>
-    </w:p>
-    <w:p>
-      <w:pPr>
-        <w:pBdr>
-          <w:top w:val="single" w:color="000000" w:sz="8" w:space="0"/>
-          <w:left w:val="none" w:color="auto" w:sz="0" w:space="0"/>
-          <w:bottom w:val="single" w:color="000000" w:sz="8" w:space="0"/>
-          <w:right w:val="none" w:color="auto" w:sz="0" w:space="0"/>
-        </w:pBdr>
-        <w:spacing w:before="0" w:after="0" w:line="300" w:lineRule="exact"/>
-        <w:ind w:firstLine="0"/>
-        <w:rPr>
-          <w:i/>
-          <w:iCs/>
-        </w:rPr>
-      </w:pPr>
-      <w:r>
-        <w:rPr>
-          <w:rFonts w:hint="default"/>
-          <w:i/>
-          <w:iCs/>
-          <w:sz w:val="21"/>
-          <w:lang w:val="en-US"/>
-        </w:rPr>
-        <w:tab/>
-      </w:r>
-      <w:r>
-        <w:rPr>
-          <w:rFonts w:ascii="Times New Roman" w:hAnsi="Times New Roman" w:eastAsia="宋体"/>
-          <w:i/>
-          <w:iCs/>
-          <w:sz w:val="21"/>
-        </w:rPr>
-        <w:t>k₃ ← f(z + Δt k₂/2, t + Δt/2)。</w:t>
-      </w:r>
-    </w:p>
-    <w:p>
-      <w:pPr>
-        <w:pBdr>
-          <w:top w:val="single" w:color="000000" w:sz="8" w:space="0"/>
-          <w:left w:val="none" w:color="auto" w:sz="0" w:space="0"/>
-          <w:bottom w:val="single" w:color="000000" w:sz="8" w:space="0"/>
-          <w:right w:val="none" w:color="auto" w:sz="0" w:space="0"/>
-        </w:pBdr>
-        <w:spacing w:before="0" w:after="0" w:line="300" w:lineRule="exact"/>
-        <w:ind w:firstLine="0"/>
-        <w:rPr>
-          <w:i/>
-          <w:iCs/>
-        </w:rPr>
-      </w:pPr>
-      <w:r>
-        <w:rPr>
-          <w:rFonts w:hint="default"/>
-          <w:i/>
-          <w:iCs/>
-          <w:sz w:val="21"/>
-          <w:lang w:val="en-US"/>
-        </w:rPr>
-        <w:tab/>
-      </w:r>
-      <w:r>
-        <w:rPr>
-          <w:rFonts w:ascii="Times New Roman" w:hAnsi="Times New Roman" w:eastAsia="宋体"/>
-          <w:i/>
-          <w:iCs/>
-          <w:sz w:val="21"/>
-        </w:rPr>
-        <w:t>k₄ ← f(z + Δt k₃, t + Δt)。</w:t>
-      </w:r>
-    </w:p>
-    <w:p>
-      <w:pPr>
-        <w:pBdr>
-          <w:top w:val="single" w:color="000000" w:sz="8" w:space="0"/>
-          <w:left w:val="none" w:color="auto" w:sz="0" w:space="0"/>
-          <w:bottom w:val="single" w:color="000000" w:sz="8" w:space="0"/>
-          <w:right w:val="none" w:color="auto" w:sz="0" w:space="0"/>
-        </w:pBdr>
-        <w:spacing w:before="0" w:after="0" w:line="300" w:lineRule="exact"/>
-        <w:ind w:firstLine="0"/>
-        <w:rPr>
-          <w:i/>
-          <w:iCs/>
-        </w:rPr>
-      </w:pPr>
-      <w:r>
-        <w:rPr>
-          <w:rFonts w:hint="default"/>
-          <w:i/>
-          <w:iCs/>
-          <w:sz w:val="21"/>
-          <w:lang w:val="en-US"/>
-        </w:rPr>
-        <w:tab/>
-      </w:r>
-      <w:r>
-        <w:rPr>
-          <w:rFonts w:ascii="Times New Roman" w:hAnsi="Times New Roman" w:eastAsia="宋体"/>
-          <w:i/>
-          <w:iCs/>
-          <w:sz w:val="21"/>
-        </w:rPr>
-        <w:t>z ← z + Δt (k₁ + 2k₂ + 2k₃ + k₄)/6。</w:t>
-      </w:r>
-    </w:p>
-    <w:p>
-      <w:pPr>
-        <w:pBdr>
-          <w:top w:val="single" w:color="000000" w:sz="8" w:space="0"/>
-          <w:left w:val="none" w:color="auto" w:sz="0" w:space="0"/>
-          <w:bottom w:val="single" w:color="000000" w:sz="8" w:space="0"/>
-          <w:right w:val="none" w:color="auto" w:sz="0" w:space="0"/>
-        </w:pBdr>
-        <w:spacing w:before="0" w:after="0" w:line="300" w:lineRule="exact"/>
-        <w:ind w:firstLine="0"/>
-        <w:rPr>
-          <w:i/>
-          <w:iCs/>
-        </w:rPr>
-      </w:pPr>
-      <w:r>
-        <w:rPr>
-          <w:rFonts w:hint="default"/>
-          <w:i/>
-          <w:iCs/>
-          <w:sz w:val="21"/>
-          <w:lang w:val="en-US"/>
-        </w:rPr>
-        <w:tab/>
-      </w:r>
-      <w:r>
-        <w:rPr>
-          <w:rFonts w:ascii="Times New Roman" w:hAnsi="Times New Roman" w:eastAsia="宋体"/>
-          <w:i/>
-          <w:iCs/>
-          <w:sz w:val="21"/>
-        </w:rPr>
-        <w:t>t ← t + Δt；保存状态并检查数值是否有限。</w:t>
-      </w:r>
-    </w:p>
-    <w:p>
-      <w:pPr>
-        <w:pBdr>
-          <w:top w:val="none" w:color="000000" w:sz="0" w:space="0"/>
-          <w:left w:val="none" w:color="auto" w:sz="0" w:space="0"/>
-          <w:bottom w:val="single" w:color="000000" w:sz="8" w:space="0"/>
-          <w:right w:val="none" w:color="auto" w:sz="0" w:space="0"/>
-        </w:pBdr>
-        <w:spacing w:before="0" w:after="0" w:line="300" w:lineRule="exact"/>
-        <w:ind w:firstLine="0"/>
-        <w:rPr>
-          <w:rFonts w:ascii="Times New Roman" w:hAnsi="Times New Roman" w:eastAsia="宋体"/>
-          <w:sz w:val="24"/>
-        </w:rPr>
-      </w:pPr>
-      <w:r>
-        <w:rPr>
-          <w:rFonts w:ascii="Times New Roman" w:hAnsi="Times New Roman" w:eastAsia="宋体"/>
-          <w:i/>
-          <w:iCs/>
-          <w:sz w:val="21"/>
-        </w:rPr>
-        <w:t>输出：时间序列、位置速度序列及诊断量。</w:t>
-      </w:r>
-    </w:p>
+    <w:tbl>
+      <w:tblPr>
+        <w:tblW w:type="auto" w:w="0"/>
+        <w:jc w:val="center"/>
+        <w:tblLayout w:type="fixed"/>
+        <w:tblLook w:firstColumn="1" w:firstRow="1" w:lastColumn="0" w:lastRow="0" w:noHBand="0" w:noVBand="1" w:val="04A0"/>
+      </w:tblPr>
+      <w:tblGrid>
+        <w:gridCol w:w="8568"/>
+      </w:tblGrid>
+      <w:tr>
+        <w:trPr>
+          <w:cantSplit/>
+        </w:trPr>
+        <w:tc>
+          <w:tcPr>
+            <w:tcW w:type="dxa" w:w="8568"/>
+            <w:vAlign w:val="center"/>
+            <w:tcBorders>
+              <w:top w:val="single" w:sz="8" w:color="335F78"/>
+              <w:bottom w:val="single" w:sz="8" w:color="335F78"/>
+            </w:tcBorders>
+          </w:tcPr>
+          <w:p>
+            <w:pPr>
+              <w:spacing w:before="0" w:after="0" w:line="260" w:lineRule="exact"/>
+              <w:ind w:left="144"/>
+            </w:pPr>
+            <w:r/>
+            <w:r>
+              <w:rPr>
+                <w:rFonts w:ascii="Times New Roman" w:hAnsi="Times New Roman" w:eastAsia="宋体"/>
+                <w:b/>
+                <w:sz w:val="18"/>
+              </w:rPr>
+              <w:t>输入：质量数组 m；初始状态 z₀；终止时间 T；最大步长 h</w:t>
+            </w:r>
+          </w:p>
+          <w:p>
+            <w:pPr>
+              <w:spacing w:before="0" w:after="0" w:line="260" w:lineRule="exact"/>
+              <w:ind w:left="144"/>
+              <w:pBdr>
+                <w:bottom w:val="single" w:sz="6" w:color="335F78"/>
+              </w:pBdr>
+            </w:pPr>
+            <w:r>
+              <w:rPr>
+                <w:rFonts w:ascii="Times New Roman" w:hAnsi="Times New Roman" w:eastAsia="宋体"/>
+                <w:b/>
+                <w:sz w:val="18"/>
+              </w:rPr>
+              <w:t>输出：已保存的时间与状态序列</w:t>
+            </w:r>
+          </w:p>
+          <w:p>
+            <w:pPr>
+              <w:spacing w:before="0" w:after="0" w:line="260" w:lineRule="exact"/>
+              <w:ind w:left="144"/>
+            </w:pPr>
+            <w:r>
+              <w:rPr>
+                <w:rFonts w:ascii="Times New Roman" w:hAnsi="Times New Roman" w:eastAsia="宋体"/>
+                <w:sz w:val="18"/>
+              </w:rPr>
+              <w:t>01  t ← 0</w:t>
+            </w:r>
+          </w:p>
+          <w:p>
+            <w:pPr>
+              <w:spacing w:before="0" w:after="0" w:line="260" w:lineRule="exact"/>
+              <w:ind w:left="144"/>
+            </w:pPr>
+            <w:r>
+              <w:rPr>
+                <w:rFonts w:ascii="Times New Roman" w:hAnsi="Times New Roman" w:eastAsia="宋体"/>
+                <w:sz w:val="18"/>
+              </w:rPr>
+              <w:t>02  z ← z₀</w:t>
+            </w:r>
+          </w:p>
+          <w:p>
+            <w:pPr>
+              <w:spacing w:before="0" w:after="0" w:line="260" w:lineRule="exact"/>
+              <w:ind w:left="144"/>
+            </w:pPr>
+            <w:r>
+              <w:rPr>
+                <w:rFonts w:ascii="Times New Roman" w:hAnsi="Times New Roman" w:eastAsia="宋体"/>
+                <w:sz w:val="18"/>
+              </w:rPr>
+              <w:t>03  保存 (t, z)</w:t>
+            </w:r>
+          </w:p>
+          <w:p>
+            <w:pPr>
+              <w:spacing w:before="0" w:after="0" w:line="260" w:lineRule="exact"/>
+              <w:ind w:left="144"/>
+            </w:pPr>
+            <w:r>
+              <w:rPr>
+                <w:rFonts w:ascii="Times New Roman" w:hAnsi="Times New Roman" w:eastAsia="宋体"/>
+                <w:sz w:val="18"/>
+              </w:rPr>
+              <w:t>04  while t &lt; T do</w:t>
+            </w:r>
+          </w:p>
+          <w:p>
+            <w:pPr>
+              <w:spacing w:before="0" w:after="0" w:line="260" w:lineRule="exact"/>
+              <w:ind w:left="374"/>
+            </w:pPr>
+            <w:r>
+              <w:rPr>
+                <w:rFonts w:ascii="Times New Roman" w:hAnsi="Times New Roman" w:eastAsia="宋体"/>
+                <w:sz w:val="18"/>
+              </w:rPr>
+              <w:t>05  Δt ← min(h, T − t)</w:t>
+            </w:r>
+          </w:p>
+          <w:p>
+            <w:pPr>
+              <w:spacing w:before="0" w:after="0" w:line="260" w:lineRule="exact"/>
+              <w:ind w:left="374"/>
+            </w:pPr>
+            <w:r>
+              <w:rPr>
+                <w:rFonts w:ascii="Times New Roman" w:hAnsi="Times New Roman" w:eastAsia="宋体"/>
+                <w:sz w:val="18"/>
+              </w:rPr>
+              <w:t>06  k₁ ← f(t, z; m)</w:t>
+            </w:r>
+          </w:p>
+          <w:p>
+            <w:pPr>
+              <w:spacing w:before="0" w:after="0" w:line="260" w:lineRule="exact"/>
+              <w:ind w:left="374"/>
+            </w:pPr>
+            <w:r>
+              <w:rPr>
+                <w:rFonts w:ascii="Times New Roman" w:hAnsi="Times New Roman" w:eastAsia="宋体"/>
+                <w:sz w:val="18"/>
+              </w:rPr>
+              <w:t>07  k₂ ← f(t + Δt/2, z + Δt k₁/2; m)</w:t>
+            </w:r>
+          </w:p>
+          <w:p>
+            <w:pPr>
+              <w:spacing w:before="0" w:after="0" w:line="260" w:lineRule="exact"/>
+              <w:ind w:left="374"/>
+            </w:pPr>
+            <w:r>
+              <w:rPr>
+                <w:rFonts w:ascii="Times New Roman" w:hAnsi="Times New Roman" w:eastAsia="宋体"/>
+                <w:sz w:val="18"/>
+              </w:rPr>
+              <w:t>08  k₃ ← f(t + Δt/2, z + Δt k₂/2; m)</w:t>
+            </w:r>
+          </w:p>
+          <w:p>
+            <w:pPr>
+              <w:spacing w:before="0" w:after="0" w:line="260" w:lineRule="exact"/>
+              <w:ind w:left="374"/>
+            </w:pPr>
+            <w:r>
+              <w:rPr>
+                <w:rFonts w:ascii="Times New Roman" w:hAnsi="Times New Roman" w:eastAsia="宋体"/>
+                <w:sz w:val="18"/>
+              </w:rPr>
+              <w:t>09  k₄ ← f(t + Δt, z + Δt k₃; m)</w:t>
+            </w:r>
+          </w:p>
+          <w:p>
+            <w:pPr>
+              <w:spacing w:before="0" w:after="0" w:line="260" w:lineRule="exact"/>
+              <w:ind w:left="374"/>
+            </w:pPr>
+            <w:r>
+              <w:rPr>
+                <w:rFonts w:ascii="Times New Roman" w:hAnsi="Times New Roman" w:eastAsia="宋体"/>
+                <w:sz w:val="18"/>
+              </w:rPr>
+              <w:t>10  z ← z + Δt(k₁ + 2k₂ + 2k₃ + k₄)/6</w:t>
+            </w:r>
+          </w:p>
+          <w:p>
+            <w:pPr>
+              <w:spacing w:before="0" w:after="0" w:line="260" w:lineRule="exact"/>
+              <w:ind w:left="374"/>
+            </w:pPr>
+            <w:r>
+              <w:rPr>
+                <w:rFonts w:ascii="Times New Roman" w:hAnsi="Times New Roman" w:eastAsia="宋体"/>
+                <w:sz w:val="18"/>
+              </w:rPr>
+              <w:t>11  t ← t + Δt</w:t>
+            </w:r>
+          </w:p>
+          <w:p>
+            <w:pPr>
+              <w:spacing w:before="0" w:after="0" w:line="260" w:lineRule="exact"/>
+              <w:ind w:left="374"/>
+            </w:pPr>
+            <w:r>
+              <w:rPr>
+                <w:rFonts w:ascii="Times New Roman" w:hAnsi="Times New Roman" w:eastAsia="宋体"/>
+                <w:sz w:val="18"/>
+              </w:rPr>
+              <w:t>12  if z 含非有限值 then</w:t>
+            </w:r>
+          </w:p>
+          <w:p>
+            <w:pPr>
+              <w:spacing w:before="0" w:after="0" w:line="260" w:lineRule="exact"/>
+              <w:ind w:left="605"/>
+            </w:pPr>
+            <w:r>
+              <w:rPr>
+                <w:rFonts w:ascii="Times New Roman" w:hAnsi="Times New Roman" w:eastAsia="宋体"/>
+                <w:sz w:val="18"/>
+              </w:rPr>
+              <w:t>13  return 积分失败</w:t>
+            </w:r>
+          </w:p>
+          <w:p>
+            <w:pPr>
+              <w:spacing w:before="0" w:after="0" w:line="260" w:lineRule="exact"/>
+              <w:ind w:left="374"/>
+            </w:pPr>
+            <w:r>
+              <w:rPr>
+                <w:rFonts w:ascii="Times New Roman" w:hAnsi="Times New Roman" w:eastAsia="宋体"/>
+                <w:sz w:val="18"/>
+              </w:rPr>
+              <w:t>14  end if</w:t>
+            </w:r>
+          </w:p>
+          <w:p>
+            <w:pPr>
+              <w:spacing w:before="0" w:after="0" w:line="260" w:lineRule="exact"/>
+              <w:ind w:left="374"/>
+            </w:pPr>
+            <w:r>
+              <w:rPr>
+                <w:rFonts w:ascii="Times New Roman" w:hAnsi="Times New Roman" w:eastAsia="宋体"/>
+                <w:sz w:val="18"/>
+              </w:rPr>
+              <w:t>15  保存 (t, z)</w:t>
+            </w:r>
+          </w:p>
+          <w:p>
+            <w:pPr>
+              <w:spacing w:before="0" w:after="0" w:line="260" w:lineRule="exact"/>
+              <w:ind w:left="144"/>
+            </w:pPr>
+            <w:r>
+              <w:rPr>
+                <w:rFonts w:ascii="Times New Roman" w:hAnsi="Times New Roman" w:eastAsia="宋体"/>
+                <w:sz w:val="18"/>
+              </w:rPr>
+              <w:t>16  end while</w:t>
+            </w:r>
+          </w:p>
+          <w:p>
+            <w:pPr>
+              <w:spacing w:before="0" w:after="0" w:line="260" w:lineRule="exact"/>
+              <w:ind w:left="144"/>
+            </w:pPr>
+            <w:r>
+              <w:rPr>
+                <w:rFonts w:ascii="Times New Roman" w:hAnsi="Times New Roman" w:eastAsia="宋体"/>
+                <w:sz w:val="18"/>
+              </w:rPr>
+              <w:t>17  return 已保存的时间与状态序列</w:t>
+            </w:r>
+          </w:p>
+        </w:tc>
+      </w:tr>
+    </w:tbl>
     <w:p>
       <w:pPr>
         <w:spacing w:before="0" w:after="0" w:line="400" w:lineRule="exact"/>
@@ -3154,11 +2609,11 @@
       </w:pPr>
       <w:r>
         <w:rPr>
-          <w:rFonts w:ascii="Times New Roman" w:hAnsi="Times New Roman" w:eastAsia="黑体"/>
+          <w:rFonts w:ascii="Times New Roman" w:hAnsi="Times New Roman" w:eastAsia="宋体"/>
           <w:b/>
           <w:sz w:val="24"/>
         </w:rPr>
-        <w:t>2  基本任务结果与分析</w:t>
+        <w:t>2  单体、二体与三体结果</w:t>
       </w:r>
     </w:p>
     <w:p>
@@ -3169,11 +2624,23 @@
       </w:pPr>
       <w:r>
         <w:rPr>
-          <w:rFonts w:ascii="Times New Roman" w:hAnsi="Times New Roman" w:eastAsia="黑体"/>
+          <w:rFonts w:ascii="Times New Roman" w:hAnsi="Times New Roman" w:eastAsia="宋体"/>
           <w:b/>
           <w:sz w:val="21"/>
         </w:rPr>
-        <w:t>2.1  固定中心力的抛物线解</w:t>
+        <w:t>2.1  单体轨道与解析验证</w:t>
+      </w:r>
+    </w:p>
+    <w:p>
+      <w:pPr>
+        <w:spacing w:line="400" w:lineRule="exact" w:before="0" w:after="0"/>
+        <w:ind w:firstLine="480"/>
+      </w:pPr>
+      <w:r>
+        <w:rPr>
+          <w:rFonts w:ascii="Times New Roman" w:hAnsi="Times New Roman"/>
+        </w:rPr>
+        <w:t>固定中心力的标量方程为 d²x/dt² = −x/(x²+y²)^(3/2)，d²y/dt² = −y/(x²+y²)^(3/2)，其中 G=M=1。</w:t>
       </w:r>
     </w:p>
     <w:p>
@@ -3184,9 +2651,10 @@
       <w:r>
         <w:rPr>
           <w:rFonts w:ascii="Times New Roman" w:hAnsi="Times New Roman" w:eastAsia="宋体"/>
-          <w:sz w:val="24"/>
-        </w:rPr>
-        <w:t>由初值可得单位质量机械能为 v²/2−1/r=0，角动量为 −2，故轨道为抛物线而非椭圆。设辅助变量 D 满足 D+D³/3=t/4，则解析位置与速度为</w:t>
+          <w:b w:val="0"/>
+          <w:sz w:val="24"/>
+        </w:rPr>
+        <w:t>固定中心质量 M=1，卫星初始位置 (x₀,y₀)=(0,2)、初始速度 (vₓ₀,vᵧ₀)=(1,0)，积分至 T=50。由初值得单位质量机械能 v²/2−1/r=0，角动量为 −2，故轨道是抛物线。设辅助变量 D 满足 D+D³/3=t/4，则解析位置与速度为</w:t>
       </w:r>
     </w:p>
     <w:p>
@@ -3471,9 +2939,10 @@
       <w:r>
         <w:rPr>
           <w:rFonts w:ascii="Times New Roman" w:hAnsi="Times New Roman" w:eastAsia="宋体"/>
-          <w:sz w:val="24"/>
-        </w:rPr>
-        <w:t>消去 D 得 x²=16−8y。RK4 与解析完整状态的最大误差约为 4.14×10⁻¹³，轨道形态和误差检验一致。该结论依赖补充假设 GM=1；若中心质量不同，同一初始速度可能对应不同类型的圆锥曲线。</w:t>
+          <w:b w:val="0"/>
+          <w:sz w:val="24"/>
+        </w:rPr>
+        <w:t>消去 D 得 x²=16−8y。数值轨迹如图 2-1 所示，与解析轨迹吻合。该结论依赖补充假设 GM=1；若中心质量不同，同一初始速度可能对应不同类型的圆锥曲线。</w:t>
       </w:r>
     </w:p>
     <w:p>
@@ -3540,17 +3009,31 @@
     </w:p>
     <w:p>
       <w:pPr>
+        <w:spacing w:before="0" w:after="0" w:line="400" w:lineRule="exact"/>
+        <w:ind w:firstLine="480"/>
+      </w:pPr>
+      <w:r>
+        <w:rPr>
+          <w:rFonts w:ascii="Times New Roman" w:hAnsi="Times New Roman" w:eastAsia="宋体"/>
+          <w:b w:val="0"/>
+          <w:sz w:val="24"/>
+        </w:rPr>
+        <w:t>正确性检验：RK4 与解析完整状态的最大差为 4.14×10⁻¹³；与独立 DOP853 的最大状态差为 1.51×10⁻¹³；h 从 0.001 减半后的最大状态差为 2.31×10⁻¹³；时间反演误差为 1.33×10⁻¹⁵。四项检验共同支持图 2-1 的数值结果。</w:t>
+      </w:r>
+    </w:p>
+    <w:p>
+      <w:pPr>
         <w:pStyle w:val="2"/>
         <w:spacing w:before="0" w:after="0" w:line="300" w:lineRule="exact"/>
         <w:ind w:firstLine="0"/>
       </w:pPr>
       <w:r>
         <w:rPr>
-          <w:rFonts w:ascii="Times New Roman" w:hAnsi="Times New Roman" w:eastAsia="黑体"/>
+          <w:rFonts w:ascii="Times New Roman" w:hAnsi="Times New Roman" w:eastAsia="宋体"/>
           <w:b/>
           <w:sz w:val="21"/>
         </w:rPr>
-        <w:t>2.2  二体相对轨道与质心漂移</w:t>
+        <w:t>2.2  二体轨道、验证与微扰</w:t>
       </w:r>
     </w:p>
     <w:p>
@@ -3561,9 +3044,24 @@
       <w:r>
         <w:rPr>
           <w:rFonts w:ascii="Times New Roman" w:hAnsi="Times New Roman" w:eastAsia="宋体"/>
-          <w:sz w:val="24"/>
-        </w:rPr>
-        <w:t>本算例初始总动量为 (0.0597, −0.0597)，故惯性系轨道包含质心漂移。去除质心平动后，相对运动的半长轴约为 2.273585、偏心率约为 0.244039、周期约为 37.4964。计算终点 t=20 尚未覆盖一整周，不能将未闭合的绘图误认为算法失败。虽然总能量约为 0.00882102，但内部能量为 −0.00197925，二体相对运动仍受束缚。</w:t>
+          <w:b w:val="0"/>
+          <w:sz w:val="24"/>
+        </w:rPr>
+        <w:t>取 m₁=0.30、m₂=0.03，初始位置分别为 (2,2)、(0,0)，初始速度分别为 (0.2,−0.2)、(−0.01,0.01)，积分至 T=20。初始总动量 P₀=(0.0597,−0.0597)，故惯性系轨迹含质心平动；图 2-2 在各自质心系中显示相对轨道。</w:t>
+      </w:r>
+    </w:p>
+    <w:p>
+      <w:pPr>
+        <w:spacing w:before="0" w:after="0" w:line="400" w:lineRule="exact"/>
+        <w:ind w:firstLine="480"/>
+      </w:pPr>
+      <w:r>
+        <w:rPr>
+          <w:rFonts w:ascii="Times New Roman" w:hAnsi="Times New Roman" w:eastAsia="宋体"/>
+          <w:b w:val="0"/>
+          <w:sz w:val="24"/>
+        </w:rPr>
+        <w:t>去除质心平动后，内部能量为 −0.00197925，半长轴约 2.273585、偏心率约 0.244039、周期约 37.4964，故相对运动为椭圆。总能量虽为正值 0.00882102，但包含整体平动能；T=20 尚未覆盖一整周，不能以图线未闭合判断积分失败。</w:t>
       </w:r>
     </w:p>
     <w:p>
@@ -3630,17 +3128,102 @@
     </w:p>
     <w:p>
       <w:pPr>
+        <w:spacing w:before="0" w:after="0" w:line="400" w:lineRule="exact"/>
+        <w:ind w:firstLine="480"/>
+      </w:pPr>
+      <w:r>
+        <w:rPr>
+          <w:rFonts w:ascii="Times New Roman" w:hAnsi="Times New Roman" w:eastAsia="宋体"/>
+          <w:b w:val="0"/>
+          <w:sz w:val="24"/>
+        </w:rPr>
+        <w:t>正确性检验：与独立 DOP853 的最大状态差为 1.57×10⁻¹³，步长减半差为 1.98×10⁻¹³，时间反演误差为 6.76×10⁻¹⁵。全步能量、动量、角动量及质心直线运动的最大偏差分别约为 9.54×10⁻¹⁷、4.30×10⁻¹⁶、1.39×10⁻¹⁵ 和 3.20×10⁻¹⁴。</w:t>
+      </w:r>
+    </w:p>
+    <w:p>
+      <w:pPr>
+        <w:spacing w:before="0" w:after="0" w:line="400" w:lineRule="exact"/>
+        <w:ind w:firstLine="480"/>
+      </w:pPr>
+      <w:r>
+        <w:rPr>
+          <w:rFonts w:ascii="Times New Roman" w:hAnsi="Times New Roman" w:eastAsia="宋体"/>
+          <w:b w:val="0"/>
+          <w:sz w:val="24"/>
+        </w:rPr>
+        <w:t>将第二体初始 y 方向速度分别增加 10⁻⁶ 与 10⁻⁸。去除两次计算各自的质心平动后，在 T=20 时全体位置差的欧氏范数分别为 2.619520×10⁻⁵ 与 2.619521×10⁻⁷。图 2-3 给出位置差除以扰动幅值后的时间变化，两档曲线接近；扰动信号的步长减半差约为 10⁻¹³，远小于实际响应。</w:t>
+      </w:r>
+    </w:p>
+    <w:p>
+      <w:pPr>
+        <w:keepNext/>
+        <w:spacing w:before="160" w:after="0" w:line="240" w:lineRule="auto"/>
+        <w:ind w:firstLine="0"/>
+        <w:jc w:val="center"/>
+      </w:pPr>
+      <w:r>
+        <w:drawing>
+          <wp:inline xmlns:a="http://schemas.openxmlformats.org/drawingml/2006/main" xmlns:pic="http://schemas.openxmlformats.org/drawingml/2006/picture">
+            <wp:extent cx="4069080" cy="2288857"/>
+            <wp:docPr id="7" name="Picture 7"/>
+            <wp:cNvGraphicFramePr>
+              <a:graphicFrameLocks noChangeAspect="1"/>
+            </wp:cNvGraphicFramePr>
+            <a:graphic>
+              <a:graphicData uri="http://schemas.openxmlformats.org/drawingml/2006/picture">
+                <pic:pic>
+                  <pic:nvPicPr>
+                    <pic:cNvPr id="0" name="two_sensitivity.png"/>
+                    <pic:cNvPicPr/>
+                  </pic:nvPicPr>
+                  <pic:blipFill>
+                    <a:blip r:embed="rId16"/>
+                    <a:stretch>
+                      <a:fillRect/>
+                    </a:stretch>
+                  </pic:blipFill>
+                  <pic:spPr>
+                    <a:xfrm>
+                      <a:off x="0" y="0"/>
+                      <a:ext cx="4069080" cy="2288857"/>
+                    </a:xfrm>
+                    <a:prstGeom prst="rect"/>
+                  </pic:spPr>
+                </pic:pic>
+              </a:graphicData>
+            </a:graphic>
+          </wp:inline>
+        </w:drawing>
+      </w:r>
+    </w:p>
+    <w:p>
+      <w:pPr>
+        <w:pStyle w:val="4"/>
+        <w:spacing w:before="0" w:after="160" w:line="240" w:lineRule="auto"/>
+        <w:jc w:val="center"/>
+      </w:pPr>
+      <w:r>
+        <w:rPr>
+          <w:rFonts w:ascii="Times New Roman" w:hAnsi="Times New Roman" w:eastAsia="宋体"/>
+          <w:b w:val="0"/>
+          <w:sz w:val="21"/>
+        </w:rPr>
+        <w:t>图2-3  二体去质心轨迹差随时间的变化（纵轴为位置差／速度扰动幅值）</w:t>
+      </w:r>
+    </w:p>
+    <w:p>
+      <w:pPr>
         <w:pStyle w:val="2"/>
         <w:spacing w:before="0" w:after="0" w:line="300" w:lineRule="exact"/>
         <w:ind w:firstLine="0"/>
       </w:pPr>
       <w:r>
         <w:rPr>
-          <w:rFonts w:ascii="Times New Roman" w:hAnsi="Times New Roman" w:eastAsia="黑体"/>
+          <w:rFonts w:ascii="Times New Roman" w:hAnsi="Times New Roman" w:eastAsia="宋体"/>
           <w:b/>
           <w:sz w:val="21"/>
         </w:rPr>
-        <w:t>2.3  三体运动的有限时段结论</w:t>
+        <w:t>2.3  三体轨道、验证与微扰</w:t>
       </w:r>
     </w:p>
     <w:p>
@@ -3651,9 +3234,10 @@
       <w:r>
         <w:rPr>
           <w:rFonts w:ascii="Times New Roman" w:hAnsi="Times New Roman" w:eastAsia="宋体"/>
-          <w:sz w:val="24"/>
-        </w:rPr>
-        <w:t>三体初始质心为 (1.5, 1.5)，质心速度为 (0.15, −0.15)。总能量约为 0.00810883，内部能量约为 8.83118×10⁻⁶。在 t=30 时，三组两体距离约为 2.5783、14.5385 和 15.3203，表明第三体在观测时段内远离前两体。全步最小距离约为 1.4621。有限时段的分离现象尚不能证明永久逃逸，也不能直接证明混沌。</w:t>
+          <w:b w:val="0"/>
+          <w:sz w:val="24"/>
+        </w:rPr>
+        <w:t>取 m₁=0.30、m₂=m₃=0.03，初始位置依次为 (2,2)、(0,0)、(−2,−2)，初始速度依次为 (0.2,−0.2)、(0,0)、(−0.2,0.2)，积分至 T=30。初始质心为 (1.5,1.5)，质心速度为 (0.15,−0.15)；图 2-4 给出质心系运动轨迹。</w:t>
       </w:r>
     </w:p>
     <w:p>
@@ -3713,448 +3297,11 @@
       <w:r>
         <w:rPr>
           <w:rFonts w:ascii="Times New Roman" w:hAnsi="Times New Roman" w:eastAsia="宋体"/>
+          <w:b w:val="0"/>
           <w:sz w:val="21"/>
         </w:rPr>
-        <w:t>图2-3  三体运动的质心系轨迹</w:t>
-      </w:r>
-    </w:p>
-    <w:p>
-      <w:pPr>
-        <w:pStyle w:val="2"/>
-        <w:spacing w:before="0" w:after="0" w:line="300" w:lineRule="exact"/>
-        <w:ind w:firstLine="0"/>
-      </w:pPr>
-      <w:r>
-        <w:rPr>
-          <w:rFonts w:ascii="Times New Roman" w:hAnsi="Times New Roman" w:eastAsia="黑体"/>
-          <w:b/>
-          <w:sz w:val="21"/>
-        </w:rPr>
-        <w:t>2.4  误差收敛与微扰响应</w:t>
-      </w:r>
-    </w:p>
-    <w:p>
-      <w:pPr>
-        <w:pStyle w:val="4"/>
-        <w:keepNext/>
-        <w:spacing w:before="400" w:after="0" w:line="240" w:lineRule="auto"/>
-        <w:ind w:firstLine="0"/>
-        <w:jc w:val="center"/>
-      </w:pPr>
-      <w:r>
-        <w:rPr>
-          <w:rFonts w:ascii="Times New Roman" w:hAnsi="Times New Roman" w:eastAsia="宋体"/>
-          <w:sz w:val="21"/>
-        </w:rPr>
-        <w:t>表2-1  基本算例的完整状态误差</w:t>
-      </w:r>
-    </w:p>
-    <w:tbl>
-      <w:tblPr>
-        <w:tblStyle w:val="7"/>
-        <w:tblW w:w="0" w:type="auto"/>
-        <w:jc w:val="center"/>
-        <w:tblBorders>
-          <w:top w:val="single" w:color="auto" w:sz="8" w:space="0"/>
-          <w:left w:val="none" w:color="auto" w:sz="8" w:space="0"/>
-          <w:bottom w:val="single" w:color="auto" w:sz="8" w:space="0"/>
-          <w:right w:val="none" w:color="auto" w:sz="8" w:space="0"/>
-          <w:insideH w:val="none" w:color="auto" w:sz="8" w:space="0"/>
-          <w:insideV w:val="none" w:color="auto" w:sz="8" w:space="0"/>
-        </w:tblBorders>
-        <w:tblLayout w:type="fixed"/>
-        <w:tblCellMar>
-          <w:top w:w="0" w:type="dxa"/>
-          <w:left w:w="10" w:type="dxa"/>
-          <w:bottom w:w="0" w:type="dxa"/>
-          <w:right w:w="10" w:type="dxa"/>
-        </w:tblCellMar>
-      </w:tblPr>
-      <w:tblGrid>
-        <w:gridCol w:w="2076"/>
-        <w:gridCol w:w="2076"/>
-        <w:gridCol w:w="2076"/>
-        <w:gridCol w:w="2076"/>
-      </w:tblGrid>
-      <w:tr>
-        <w:trPr>
-          <w:cantSplit/>
-          <w:tblHeader/>
-          <w:jc w:val="center"/>
-        </w:trPr>
-        <w:tc>
-          <w:tcPr>
-            <w:tcW w:w="2076" w:type="dxa"/>
-            <w:tcBorders>
-              <w:bottom w:val="single" w:color="auto" w:sz="4" w:space="0"/>
-            </w:tcBorders>
-            <w:vAlign w:val="center"/>
-          </w:tcPr>
-          <w:p>
-            <w:pPr>
-              <w:keepNext/>
-              <w:spacing w:before="80" w:after="80" w:line="240" w:lineRule="auto"/>
-              <w:jc w:val="center"/>
-            </w:pPr>
-            <w:r>
-              <w:rPr>
-                <w:rFonts w:ascii="Times New Roman" w:hAnsi="Times New Roman" w:eastAsia="宋体"/>
-                <w:b/>
-                <w:sz w:val="21"/>
-              </w:rPr>
-              <w:t>算例</w:t>
-            </w:r>
-          </w:p>
-        </w:tc>
-        <w:tc>
-          <w:tcPr>
-            <w:tcW w:w="2076" w:type="dxa"/>
-            <w:tcBorders>
-              <w:bottom w:val="single" w:color="auto" w:sz="4" w:space="0"/>
-            </w:tcBorders>
-            <w:vAlign w:val="center"/>
-          </w:tcPr>
-          <w:p>
-            <w:pPr>
-              <w:keepNext/>
-              <w:spacing w:before="80" w:after="80" w:line="240" w:lineRule="auto"/>
-              <w:jc w:val="center"/>
-            </w:pPr>
-            <w:r>
-              <w:rPr>
-                <w:rFonts w:ascii="Times New Roman" w:hAnsi="Times New Roman" w:eastAsia="宋体"/>
-                <w:b/>
-                <w:sz w:val="21"/>
-              </w:rPr>
-              <w:t>与 DOP853 最大差</w:t>
-            </w:r>
-          </w:p>
-        </w:tc>
-        <w:tc>
-          <w:tcPr>
-            <w:tcW w:w="2076" w:type="dxa"/>
-            <w:tcBorders>
-              <w:bottom w:val="single" w:color="auto" w:sz="4" w:space="0"/>
-            </w:tcBorders>
-            <w:vAlign w:val="center"/>
-          </w:tcPr>
-          <w:p>
-            <w:pPr>
-              <w:keepNext/>
-              <w:spacing w:before="80" w:after="80" w:line="240" w:lineRule="auto"/>
-              <w:jc w:val="center"/>
-            </w:pPr>
-            <w:r>
-              <w:rPr>
-                <w:rFonts w:ascii="Times New Roman" w:hAnsi="Times New Roman" w:eastAsia="宋体"/>
-                <w:b/>
-                <w:sz w:val="21"/>
-              </w:rPr>
-              <w:t>步长减半最大差</w:t>
-            </w:r>
-          </w:p>
-        </w:tc>
-        <w:tc>
-          <w:tcPr>
-            <w:tcW w:w="2076" w:type="dxa"/>
-            <w:tcBorders>
-              <w:bottom w:val="single" w:color="auto" w:sz="4" w:space="0"/>
-            </w:tcBorders>
-            <w:vAlign w:val="center"/>
-          </w:tcPr>
-          <w:p>
-            <w:pPr>
-              <w:keepNext/>
-              <w:spacing w:before="80" w:after="80" w:line="240" w:lineRule="auto"/>
-              <w:jc w:val="center"/>
-            </w:pPr>
-            <w:r>
-              <w:rPr>
-                <w:rFonts w:ascii="Times New Roman" w:hAnsi="Times New Roman" w:eastAsia="宋体"/>
-                <w:b/>
-                <w:sz w:val="21"/>
-              </w:rPr>
-              <w:t>时间反演误差</w:t>
-            </w:r>
-          </w:p>
-        </w:tc>
-      </w:tr>
-      <w:tr>
-        <w:trPr>
-          <w:cantSplit/>
-          <w:jc w:val="center"/>
-        </w:trPr>
-        <w:tc>
-          <w:tcPr>
-            <w:tcW w:w="2076" w:type="dxa"/>
-            <w:vAlign w:val="center"/>
-          </w:tcPr>
-          <w:p>
-            <w:pPr>
-              <w:keepNext/>
-              <w:spacing w:before="80" w:after="80" w:line="240" w:lineRule="auto"/>
-              <w:jc w:val="center"/>
-            </w:pPr>
-            <w:r>
-              <w:rPr>
-                <w:rFonts w:ascii="Times New Roman" w:hAnsi="Times New Roman" w:eastAsia="宋体"/>
-                <w:b w:val="0"/>
-                <w:sz w:val="21"/>
-              </w:rPr>
-              <w:t>单体</w:t>
-            </w:r>
-          </w:p>
-        </w:tc>
-        <w:tc>
-          <w:tcPr>
-            <w:tcW w:w="2076" w:type="dxa"/>
-            <w:vAlign w:val="center"/>
-          </w:tcPr>
-          <w:p>
-            <w:pPr>
-              <w:keepNext/>
-              <w:spacing w:before="80" w:after="80" w:line="240" w:lineRule="auto"/>
-              <w:jc w:val="center"/>
-            </w:pPr>
-            <w:r>
-              <w:rPr>
-                <w:rFonts w:ascii="Times New Roman" w:hAnsi="Times New Roman" w:eastAsia="宋体"/>
-                <w:b w:val="0"/>
-                <w:sz w:val="21"/>
-              </w:rPr>
-              <w:t>1.51×10⁻¹³</w:t>
-            </w:r>
-          </w:p>
-        </w:tc>
-        <w:tc>
-          <w:tcPr>
-            <w:tcW w:w="2076" w:type="dxa"/>
-            <w:vAlign w:val="center"/>
-          </w:tcPr>
-          <w:p>
-            <w:pPr>
-              <w:keepNext/>
-              <w:spacing w:before="80" w:after="80" w:line="240" w:lineRule="auto"/>
-              <w:jc w:val="center"/>
-            </w:pPr>
-            <w:r>
-              <w:rPr>
-                <w:rFonts w:ascii="Times New Roman" w:hAnsi="Times New Roman" w:eastAsia="宋体"/>
-                <w:b w:val="0"/>
-                <w:sz w:val="21"/>
-              </w:rPr>
-              <w:t>2.31×10⁻¹³</w:t>
-            </w:r>
-          </w:p>
-        </w:tc>
-        <w:tc>
-          <w:tcPr>
-            <w:tcW w:w="2076" w:type="dxa"/>
-            <w:vAlign w:val="center"/>
-          </w:tcPr>
-          <w:p>
-            <w:pPr>
-              <w:keepNext/>
-              <w:spacing w:before="80" w:after="80" w:line="240" w:lineRule="auto"/>
-              <w:jc w:val="center"/>
-            </w:pPr>
-            <w:r>
-              <w:rPr>
-                <w:rFonts w:ascii="Times New Roman" w:hAnsi="Times New Roman" w:eastAsia="宋体"/>
-                <w:b w:val="0"/>
-                <w:sz w:val="21"/>
-              </w:rPr>
-              <w:t>1.33×10⁻¹⁵</w:t>
-            </w:r>
-          </w:p>
-        </w:tc>
-      </w:tr>
-      <w:tr>
-        <w:trPr>
-          <w:cantSplit/>
-          <w:jc w:val="center"/>
-        </w:trPr>
-        <w:tc>
-          <w:tcPr>
-            <w:tcW w:w="2076" w:type="dxa"/>
-            <w:vAlign w:val="center"/>
-          </w:tcPr>
-          <w:p>
-            <w:pPr>
-              <w:keepNext/>
-              <w:spacing w:before="80" w:after="80" w:line="240" w:lineRule="auto"/>
-              <w:jc w:val="center"/>
-            </w:pPr>
-            <w:r>
-              <w:rPr>
-                <w:rFonts w:ascii="Times New Roman" w:hAnsi="Times New Roman" w:eastAsia="宋体"/>
-                <w:b w:val="0"/>
-                <w:sz w:val="21"/>
-              </w:rPr>
-              <w:t>二体</w:t>
-            </w:r>
-          </w:p>
-        </w:tc>
-        <w:tc>
-          <w:tcPr>
-            <w:tcW w:w="2076" w:type="dxa"/>
-            <w:vAlign w:val="center"/>
-          </w:tcPr>
-          <w:p>
-            <w:pPr>
-              <w:keepNext/>
-              <w:spacing w:before="80" w:after="80" w:line="240" w:lineRule="auto"/>
-              <w:jc w:val="center"/>
-            </w:pPr>
-            <w:r>
-              <w:rPr>
-                <w:rFonts w:ascii="Times New Roman" w:hAnsi="Times New Roman" w:eastAsia="宋体"/>
-                <w:b w:val="0"/>
-                <w:sz w:val="21"/>
-              </w:rPr>
-              <w:t>1.57×10⁻¹³</w:t>
-            </w:r>
-          </w:p>
-        </w:tc>
-        <w:tc>
-          <w:tcPr>
-            <w:tcW w:w="2076" w:type="dxa"/>
-            <w:vAlign w:val="center"/>
-          </w:tcPr>
-          <w:p>
-            <w:pPr>
-              <w:keepNext/>
-              <w:spacing w:before="80" w:after="80" w:line="240" w:lineRule="auto"/>
-              <w:jc w:val="center"/>
-            </w:pPr>
-            <w:r>
-              <w:rPr>
-                <w:rFonts w:ascii="Times New Roman" w:hAnsi="Times New Roman" w:eastAsia="宋体"/>
-                <w:b w:val="0"/>
-                <w:sz w:val="21"/>
-              </w:rPr>
-              <w:t>1.98×10⁻¹³</w:t>
-            </w:r>
-          </w:p>
-        </w:tc>
-        <w:tc>
-          <w:tcPr>
-            <w:tcW w:w="2076" w:type="dxa"/>
-            <w:vAlign w:val="center"/>
-          </w:tcPr>
-          <w:p>
-            <w:pPr>
-              <w:keepNext/>
-              <w:spacing w:before="80" w:after="80" w:line="240" w:lineRule="auto"/>
-              <w:jc w:val="center"/>
-            </w:pPr>
-            <w:r>
-              <w:rPr>
-                <w:rFonts w:ascii="Times New Roman" w:hAnsi="Times New Roman" w:eastAsia="宋体"/>
-                <w:b w:val="0"/>
-                <w:sz w:val="21"/>
-              </w:rPr>
-              <w:t>6.76×10⁻¹⁵</w:t>
-            </w:r>
-          </w:p>
-        </w:tc>
-      </w:tr>
-      <w:tr>
-        <w:trPr>
-          <w:cantSplit/>
-          <w:jc w:val="center"/>
-        </w:trPr>
-        <w:tc>
-          <w:tcPr>
-            <w:tcW w:w="2076" w:type="dxa"/>
-            <w:vAlign w:val="center"/>
-          </w:tcPr>
-          <w:p>
-            <w:pPr>
-              <w:keepNext w:val="0"/>
-              <w:spacing w:before="80" w:after="80" w:line="240" w:lineRule="auto"/>
-              <w:jc w:val="center"/>
-            </w:pPr>
-            <w:r>
-              <w:rPr>
-                <w:rFonts w:ascii="Times New Roman" w:hAnsi="Times New Roman" w:eastAsia="宋体"/>
-                <w:b w:val="0"/>
-                <w:sz w:val="21"/>
-              </w:rPr>
-              <w:t>三体</w:t>
-            </w:r>
-          </w:p>
-        </w:tc>
-        <w:tc>
-          <w:tcPr>
-            <w:tcW w:w="2076" w:type="dxa"/>
-            <w:vAlign w:val="center"/>
-          </w:tcPr>
-          <w:p>
-            <w:pPr>
-              <w:keepNext w:val="0"/>
-              <w:spacing w:before="80" w:after="80" w:line="240" w:lineRule="auto"/>
-              <w:jc w:val="center"/>
-            </w:pPr>
-            <w:r>
-              <w:rPr>
-                <w:rFonts w:ascii="Times New Roman" w:hAnsi="Times New Roman" w:eastAsia="宋体"/>
-                <w:b w:val="0"/>
-                <w:sz w:val="21"/>
-              </w:rPr>
-              <w:t>1.47×10⁻¹²</w:t>
-            </w:r>
-          </w:p>
-        </w:tc>
-        <w:tc>
-          <w:tcPr>
-            <w:tcW w:w="2076" w:type="dxa"/>
-            <w:vAlign w:val="center"/>
-          </w:tcPr>
-          <w:p>
-            <w:pPr>
-              <w:keepNext w:val="0"/>
-              <w:spacing w:before="80" w:after="80" w:line="240" w:lineRule="auto"/>
-              <w:jc w:val="center"/>
-            </w:pPr>
-            <w:r>
-              <w:rPr>
-                <w:rFonts w:ascii="Times New Roman" w:hAnsi="Times New Roman" w:eastAsia="宋体"/>
-                <w:b w:val="0"/>
-                <w:sz w:val="21"/>
-              </w:rPr>
-              <w:t>1.34×10⁻¹³</w:t>
-            </w:r>
-          </w:p>
-        </w:tc>
-        <w:tc>
-          <w:tcPr>
-            <w:tcW w:w="2076" w:type="dxa"/>
-            <w:vAlign w:val="center"/>
-          </w:tcPr>
-          <w:p>
-            <w:pPr>
-              <w:keepNext w:val="0"/>
-              <w:spacing w:before="80" w:after="80" w:line="240" w:lineRule="auto"/>
-              <w:jc w:val="center"/>
-            </w:pPr>
-            <w:r>
-              <w:rPr>
-                <w:rFonts w:ascii="Times New Roman" w:hAnsi="Times New Roman" w:eastAsia="宋体"/>
-                <w:b w:val="0"/>
-                <w:sz w:val="21"/>
-              </w:rPr>
-              <w:t>5.31×10⁻¹⁵</w:t>
-            </w:r>
-          </w:p>
-        </w:tc>
-      </w:tr>
-    </w:tbl>
-    <w:p>
-      <w:pPr>
-        <w:spacing w:before="0" w:after="0" w:line="200" w:lineRule="exact"/>
-        <w:ind w:firstLine="0"/>
-      </w:pPr>
+        <w:t>图2-4  三体运动的质心系轨迹</w:t>
+      </w:r>
     </w:p>
     <w:p>
       <w:pPr>
@@ -4164,38 +3311,36 @@
       <w:r>
         <w:rPr>
           <w:rFonts w:ascii="Times New Roman" w:hAnsi="Times New Roman" w:eastAsia="宋体"/>
-          <w:sz w:val="24"/>
-        </w:rPr>
-        <w:t>表 2-1 使用 h=0.001，减半对照为 h=0.0005。较粗步长扫描呈现 RK4 的收敛趋势，细步长结果达到参考与浮点误差平台。二体全步能量、动量、角动量、质心误差分别约为 9.54×10⁻¹⁷、4.30×10⁻¹⁶、1.39×10⁻¹⁵ 和 3.20×10⁻¹⁴；三体对应约为 3.59×10⁻¹⁶、8.19×10⁻¹⁶、3.44×10⁻¹⁵ 和 3.91×10⁻¹⁴。守恒检验支持数值一致性，但必须结合轨迹对照使用。</w:t>
+          <w:b w:val="0"/>
+          <w:sz w:val="24"/>
+        </w:rPr>
+        <w:t>在 T=30 时，三组两体距离约为 2.5783、14.5385、15.3203，距离变化见图 2-5；全步最小两体距离约为 1.4621。总能量约 0.00810883，内部能量约 8.83118×10⁻⁶。第三体在观测时段内远离前两体，但有限时间轨迹尚不能证明永久逃逸，也不能直接证明混沌。</w:t>
       </w:r>
     </w:p>
     <w:p>
       <w:pPr>
         <w:keepNext/>
-        <w:spacing w:before="400" w:after="0" w:line="240" w:lineRule="auto"/>
+        <w:spacing w:before="160" w:after="0" w:line="240" w:lineRule="auto"/>
         <w:ind w:firstLine="0"/>
         <w:jc w:val="center"/>
       </w:pPr>
       <w:r>
         <w:drawing>
-          <wp:inline distT="0" distB="0" distL="114300" distR="114300">
-            <wp:extent cx="4139565" cy="2759710"/>
-            <wp:effectExtent l="0" t="0" r="635" b="8890"/>
-            <wp:docPr id="4" name="Picture 4" descr="图2-4  基本算例对独立参考轨迹的步长收敛"/>
+          <wp:inline xmlns:a="http://schemas.openxmlformats.org/drawingml/2006/main" xmlns:pic="http://schemas.openxmlformats.org/drawingml/2006/picture">
+            <wp:extent cx="3886200" cy="2590800"/>
+            <wp:docPr id="8" name="Picture 8"/>
             <wp:cNvGraphicFramePr>
-              <a:graphicFrameLocks xmlns:a="http://schemas.openxmlformats.org/drawingml/2006/main" noChangeAspect="1"/>
+              <a:graphicFrameLocks noChangeAspect="1"/>
             </wp:cNvGraphicFramePr>
-            <a:graphic xmlns:a="http://schemas.openxmlformats.org/drawingml/2006/main">
+            <a:graphic>
               <a:graphicData uri="http://schemas.openxmlformats.org/drawingml/2006/picture">
-                <pic:pic xmlns:pic="http://schemas.openxmlformats.org/drawingml/2006/picture">
+                <pic:pic>
                   <pic:nvPicPr>
-                    <pic:cNvPr id="4" name="Picture 4" descr="图2-4  基本算例对独立参考轨迹的步长收敛"/>
-                    <pic:cNvPicPr>
-                      <a:picLocks noChangeAspect="1"/>
-                    </pic:cNvPicPr>
+                    <pic:cNvPr id="0" name="three_distances.png"/>
+                    <pic:cNvPicPr/>
                   </pic:nvPicPr>
                   <pic:blipFill>
-                    <a:blip r:embed="rId11"/>
+                    <a:blip r:embed="rId17"/>
                     <a:stretch>
                       <a:fillRect/>
                     </a:stretch>
@@ -4203,11 +3348,9 @@
                   <pic:spPr>
                     <a:xfrm>
                       <a:off x="0" y="0"/>
-                      <a:ext cx="4140000" cy="2760000"/>
+                      <a:ext cx="3886200" cy="2590800"/>
                     </a:xfrm>
-                    <a:prstGeom prst="rect">
-                      <a:avLst/>
-                    </a:prstGeom>
+                    <a:prstGeom prst="rect"/>
                   </pic:spPr>
                 </pic:pic>
               </a:graphicData>
@@ -4219,16 +3362,16 @@
     <w:p>
       <w:pPr>
         <w:pStyle w:val="4"/>
-        <w:spacing w:before="0" w:after="400" w:line="240" w:lineRule="auto"/>
-        <w:ind w:firstLine="0"/>
+        <w:spacing w:before="0" w:after="160" w:line="240" w:lineRule="auto"/>
         <w:jc w:val="center"/>
       </w:pPr>
       <w:r>
         <w:rPr>
           <w:rFonts w:ascii="Times New Roman" w:hAnsi="Times New Roman" w:eastAsia="宋体"/>
+          <w:b w:val="0"/>
           <w:sz w:val="21"/>
         </w:rPr>
-        <w:t>图2-4  基本算例对独立参考轨迹的步长收敛</w:t>
+        <w:t>图2-5  三体算例中三组两体距离随时间的变化</w:t>
       </w:r>
     </w:p>
     <w:p>
@@ -4239,343 +3382,11 @@
       <w:r>
         <w:rPr>
           <w:rFonts w:ascii="Times New Roman" w:hAnsi="Times New Roman" w:eastAsia="宋体"/>
-          <w:sz w:val="24"/>
-        </w:rPr>
-        <w:t>二体对第二体初始 y 方向速度加扰动，三体对第三体初始 x 方向速度加扰动，分别取 10⁻⁶ 和 10⁻⁸。比较量为去除各自质心后的全体位置差的欧氏范数，不能与单个物体位置差混用。</w:t>
-      </w:r>
-    </w:p>
-    <w:p>
-      <w:pPr>
-        <w:pStyle w:val="4"/>
-        <w:keepNext/>
-        <w:spacing w:before="400" w:after="0" w:line="240" w:lineRule="auto"/>
-        <w:ind w:firstLine="0"/>
-        <w:jc w:val="center"/>
-      </w:pPr>
-      <w:r>
-        <w:rPr>
-          <w:rFonts w:ascii="Times New Roman" w:hAnsi="Times New Roman" w:eastAsia="宋体"/>
-          <w:sz w:val="21"/>
-        </w:rPr>
-        <w:t>表2-2  去质心后的末态位置微扰响应</w:t>
-      </w:r>
-    </w:p>
-    <w:tbl>
-      <w:tblPr>
-        <w:tblStyle w:val="7"/>
-        <w:tblW w:w="0" w:type="auto"/>
-        <w:jc w:val="center"/>
-        <w:tblBorders>
-          <w:top w:val="single" w:color="auto" w:sz="8" w:space="0"/>
-          <w:left w:val="none" w:color="auto" w:sz="8" w:space="0"/>
-          <w:bottom w:val="single" w:color="auto" w:sz="8" w:space="0"/>
-          <w:right w:val="none" w:color="auto" w:sz="8" w:space="0"/>
-          <w:insideH w:val="none" w:color="auto" w:sz="8" w:space="0"/>
-          <w:insideV w:val="none" w:color="auto" w:sz="8" w:space="0"/>
-        </w:tblBorders>
-        <w:tblLayout w:type="fixed"/>
-        <w:tblCellMar>
-          <w:top w:w="0" w:type="dxa"/>
-          <w:left w:w="10" w:type="dxa"/>
-          <w:bottom w:w="0" w:type="dxa"/>
-          <w:right w:w="10" w:type="dxa"/>
-        </w:tblCellMar>
-      </w:tblPr>
-      <w:tblGrid>
-        <w:gridCol w:w="2076"/>
-        <w:gridCol w:w="2076"/>
-        <w:gridCol w:w="2076"/>
-        <w:gridCol w:w="2076"/>
-      </w:tblGrid>
-      <w:tr>
-        <w:trPr>
-          <w:cantSplit/>
-          <w:tblHeader/>
-          <w:jc w:val="center"/>
-        </w:trPr>
-        <w:tc>
-          <w:tcPr>
-            <w:tcW w:w="2076" w:type="dxa"/>
-            <w:tcBorders>
-              <w:bottom w:val="single" w:color="auto" w:sz="4" w:space="0"/>
-            </w:tcBorders>
-            <w:vAlign w:val="center"/>
-          </w:tcPr>
-          <w:p>
-            <w:pPr>
-              <w:keepNext/>
-              <w:spacing w:before="80" w:after="80" w:line="240" w:lineRule="auto"/>
-              <w:jc w:val="center"/>
-            </w:pPr>
-            <w:r>
-              <w:rPr>
-                <w:rFonts w:ascii="Times New Roman" w:hAnsi="Times New Roman" w:eastAsia="宋体"/>
-                <w:b/>
-                <w:sz w:val="21"/>
-              </w:rPr>
-              <w:t>算例</w:t>
-            </w:r>
-          </w:p>
-        </w:tc>
-        <w:tc>
-          <w:tcPr>
-            <w:tcW w:w="2076" w:type="dxa"/>
-            <w:tcBorders>
-              <w:bottom w:val="single" w:color="auto" w:sz="4" w:space="0"/>
-            </w:tcBorders>
-            <w:vAlign w:val="center"/>
-          </w:tcPr>
-          <w:p>
-            <w:pPr>
-              <w:keepNext/>
-              <w:spacing w:before="80" w:after="80" w:line="240" w:lineRule="auto"/>
-              <w:jc w:val="center"/>
-            </w:pPr>
-            <w:r>
-              <w:rPr>
-                <w:rFonts w:ascii="Times New Roman" w:hAnsi="Times New Roman" w:eastAsia="宋体"/>
-                <w:b/>
-                <w:sz w:val="21"/>
-              </w:rPr>
-              <w:t>速度扰动 10⁻⁶</w:t>
-            </w:r>
-          </w:p>
-        </w:tc>
-        <w:tc>
-          <w:tcPr>
-            <w:tcW w:w="2076" w:type="dxa"/>
-            <w:tcBorders>
-              <w:bottom w:val="single" w:color="auto" w:sz="4" w:space="0"/>
-            </w:tcBorders>
-            <w:vAlign w:val="center"/>
-          </w:tcPr>
-          <w:p>
-            <w:pPr>
-              <w:keepNext/>
-              <w:spacing w:before="80" w:after="80" w:line="240" w:lineRule="auto"/>
-              <w:jc w:val="center"/>
-            </w:pPr>
-            <w:r>
-              <w:rPr>
-                <w:rFonts w:ascii="Times New Roman" w:hAnsi="Times New Roman" w:eastAsia="宋体"/>
-                <w:b/>
-                <w:sz w:val="21"/>
-              </w:rPr>
-              <w:t>速度扰动 10⁻⁸</w:t>
-            </w:r>
-          </w:p>
-        </w:tc>
-        <w:tc>
-          <w:tcPr>
-            <w:tcW w:w="2076" w:type="dxa"/>
-            <w:tcBorders>
-              <w:bottom w:val="single" w:color="auto" w:sz="4" w:space="0"/>
-            </w:tcBorders>
-            <w:vAlign w:val="center"/>
-          </w:tcPr>
-          <w:p>
-            <w:pPr>
-              <w:keepNext/>
-              <w:spacing w:before="80" w:after="80" w:line="240" w:lineRule="auto"/>
-              <w:jc w:val="center"/>
-            </w:pPr>
-            <w:r>
-              <w:rPr>
-                <w:rFonts w:ascii="Times New Roman" w:hAnsi="Times New Roman" w:eastAsia="宋体"/>
-                <w:b/>
-                <w:sz w:val="21"/>
-              </w:rPr>
-              <w:t>终止时间</w:t>
-            </w:r>
-          </w:p>
-        </w:tc>
-      </w:tr>
-      <w:tr>
-        <w:trPr>
-          <w:cantSplit/>
-          <w:jc w:val="center"/>
-        </w:trPr>
-        <w:tc>
-          <w:tcPr>
-            <w:tcW w:w="2076" w:type="dxa"/>
-            <w:vAlign w:val="center"/>
-          </w:tcPr>
-          <w:p>
-            <w:pPr>
-              <w:keepNext/>
-              <w:spacing w:before="80" w:after="80" w:line="240" w:lineRule="auto"/>
-              <w:jc w:val="center"/>
-            </w:pPr>
-            <w:r>
-              <w:rPr>
-                <w:rFonts w:ascii="Times New Roman" w:hAnsi="Times New Roman" w:eastAsia="宋体"/>
-                <w:b w:val="0"/>
-                <w:sz w:val="21"/>
-              </w:rPr>
-              <w:t>二体</w:t>
-            </w:r>
-          </w:p>
-        </w:tc>
-        <w:tc>
-          <w:tcPr>
-            <w:tcW w:w="2076" w:type="dxa"/>
-            <w:vAlign w:val="center"/>
-          </w:tcPr>
-          <w:p>
-            <w:pPr>
-              <w:keepNext/>
-              <w:spacing w:before="80" w:after="80" w:line="240" w:lineRule="auto"/>
-              <w:jc w:val="center"/>
-            </w:pPr>
-            <w:r>
-              <w:rPr>
-                <w:rFonts w:ascii="Times New Roman" w:hAnsi="Times New Roman" w:eastAsia="宋体"/>
-                <w:b w:val="0"/>
-                <w:sz w:val="21"/>
-              </w:rPr>
-              <w:t>2.619520×10⁻⁵</w:t>
-            </w:r>
-          </w:p>
-        </w:tc>
-        <w:tc>
-          <w:tcPr>
-            <w:tcW w:w="2076" w:type="dxa"/>
-            <w:vAlign w:val="center"/>
-          </w:tcPr>
-          <w:p>
-            <w:pPr>
-              <w:keepNext/>
-              <w:spacing w:before="80" w:after="80" w:line="240" w:lineRule="auto"/>
-              <w:jc w:val="center"/>
-            </w:pPr>
-            <w:r>
-              <w:rPr>
-                <w:rFonts w:ascii="Times New Roman" w:hAnsi="Times New Roman" w:eastAsia="宋体"/>
-                <w:b w:val="0"/>
-                <w:sz w:val="21"/>
-              </w:rPr>
-              <w:t>2.619521×10⁻⁷</w:t>
-            </w:r>
-          </w:p>
-        </w:tc>
-        <w:tc>
-          <w:tcPr>
-            <w:tcW w:w="2076" w:type="dxa"/>
-            <w:vAlign w:val="center"/>
-          </w:tcPr>
-          <w:p>
-            <w:pPr>
-              <w:keepNext/>
-              <w:spacing w:before="80" w:after="80" w:line="240" w:lineRule="auto"/>
-              <w:jc w:val="center"/>
-            </w:pPr>
-            <w:r>
-              <w:rPr>
-                <w:rFonts w:ascii="Times New Roman" w:hAnsi="Times New Roman" w:eastAsia="宋体"/>
-                <w:b w:val="0"/>
-                <w:sz w:val="21"/>
-              </w:rPr>
-              <w:t>20</w:t>
-            </w:r>
-          </w:p>
-        </w:tc>
-      </w:tr>
-      <w:tr>
-        <w:trPr>
-          <w:cantSplit/>
-          <w:jc w:val="center"/>
-        </w:trPr>
-        <w:tc>
-          <w:tcPr>
-            <w:tcW w:w="2076" w:type="dxa"/>
-            <w:vAlign w:val="center"/>
-          </w:tcPr>
-          <w:p>
-            <w:pPr>
-              <w:keepNext w:val="0"/>
-              <w:spacing w:before="80" w:after="80" w:line="240" w:lineRule="auto"/>
-              <w:jc w:val="center"/>
-            </w:pPr>
-            <w:r>
-              <w:rPr>
-                <w:rFonts w:ascii="Times New Roman" w:hAnsi="Times New Roman" w:eastAsia="宋体"/>
-                <w:b w:val="0"/>
-                <w:sz w:val="21"/>
-              </w:rPr>
-              <w:t>三体</w:t>
-            </w:r>
-          </w:p>
-        </w:tc>
-        <w:tc>
-          <w:tcPr>
-            <w:tcW w:w="2076" w:type="dxa"/>
-            <w:vAlign w:val="center"/>
-          </w:tcPr>
-          <w:p>
-            <w:pPr>
-              <w:keepNext w:val="0"/>
-              <w:spacing w:before="80" w:after="80" w:line="240" w:lineRule="auto"/>
-              <w:jc w:val="center"/>
-            </w:pPr>
-            <w:r>
-              <w:rPr>
-                <w:rFonts w:ascii="Times New Roman" w:hAnsi="Times New Roman" w:eastAsia="宋体"/>
-                <w:b w:val="0"/>
-                <w:sz w:val="21"/>
-              </w:rPr>
-              <w:t>3.398810×10⁻⁵</w:t>
-            </w:r>
-          </w:p>
-        </w:tc>
-        <w:tc>
-          <w:tcPr>
-            <w:tcW w:w="2076" w:type="dxa"/>
-            <w:vAlign w:val="center"/>
-          </w:tcPr>
-          <w:p>
-            <w:pPr>
-              <w:keepNext w:val="0"/>
-              <w:spacing w:before="80" w:after="80" w:line="240" w:lineRule="auto"/>
-              <w:jc w:val="center"/>
-            </w:pPr>
-            <w:r>
-              <w:rPr>
-                <w:rFonts w:ascii="Times New Roman" w:hAnsi="Times New Roman" w:eastAsia="宋体"/>
-                <w:b w:val="0"/>
-                <w:sz w:val="21"/>
-              </w:rPr>
-              <w:t>3.398811×10⁻⁷</w:t>
-            </w:r>
-          </w:p>
-        </w:tc>
-        <w:tc>
-          <w:tcPr>
-            <w:tcW w:w="2076" w:type="dxa"/>
-            <w:vAlign w:val="center"/>
-          </w:tcPr>
-          <w:p>
-            <w:pPr>
-              <w:keepNext w:val="0"/>
-              <w:spacing w:before="80" w:after="80" w:line="240" w:lineRule="auto"/>
-              <w:jc w:val="center"/>
-            </w:pPr>
-            <w:r>
-              <w:rPr>
-                <w:rFonts w:ascii="Times New Roman" w:hAnsi="Times New Roman" w:eastAsia="宋体"/>
-                <w:b w:val="0"/>
-                <w:sz w:val="21"/>
-              </w:rPr>
-              <w:t>30</w:t>
-            </w:r>
-          </w:p>
-        </w:tc>
-      </w:tr>
-    </w:tbl>
-    <w:p>
-      <w:pPr>
-        <w:spacing w:before="0" w:after="0" w:line="200" w:lineRule="exact"/>
-        <w:ind w:firstLine="0"/>
-      </w:pPr>
+          <w:b w:val="0"/>
+          <w:sz w:val="24"/>
+        </w:rPr>
+        <w:t>正确性检验：与独立 DOP853 的最大状态差为 1.47×10⁻¹²，步长减半差为 1.34×10⁻¹³，时间反演误差为 5.31×10⁻¹⁵。全步能量、动量、角动量及质心运动偏差分别约为 3.59×10⁻¹⁶、8.19×10⁻¹⁶、3.44×10⁻¹⁵ 和 3.91×10⁻¹⁴。与二体相同，守恒检验还需结合独立轨迹对照与步长收敛判断。</w:t>
+      </w:r>
     </w:p>
     <w:p>
       <w:pPr>
@@ -4585,9 +3396,96 @@
       <w:r>
         <w:rPr>
           <w:rFonts w:ascii="Times New Roman" w:hAnsi="Times New Roman" w:eastAsia="宋体"/>
-          <w:sz w:val="24"/>
-        </w:rPr>
-        <w:t>两档扰动下响应近似随扰动幅值线性缩放。扰动信号的步长减半差处于约 10⁻¹³ 量级，明显低于表 2-2 的响应。因而本实验可以分辨有限时间内的初值敏感性；没有计算收敛的最大 Lyapunov 指数，不能把这些响应称为已证实的指数发散。</w:t>
+          <w:b w:val="0"/>
+          <w:sz w:val="24"/>
+        </w:rPr>
+        <w:t>将第三体初始 x 方向速度分别增加 10⁻⁶ 与 10⁻⁸，并在各自质心系比较轨迹。在 T=30 时，全体位置差分别为 3.398810×10⁻⁵ 与 3.398811×10⁻⁷；图 2-6 给出差值按扰动幅值归一化后的变化。两档响应近似线性缩放，且相应的步长减半差约为 10⁻¹³。本实验只验证有限时间内可分辨的初值响应，未计算收敛的 Lyapunov 指数。</w:t>
+      </w:r>
+    </w:p>
+    <w:p>
+      <w:pPr>
+        <w:keepNext/>
+        <w:spacing w:before="160" w:after="0" w:line="240" w:lineRule="auto"/>
+        <w:ind w:firstLine="0"/>
+        <w:jc w:val="center"/>
+      </w:pPr>
+      <w:r>
+        <w:drawing>
+          <wp:inline xmlns:a="http://schemas.openxmlformats.org/drawingml/2006/main" xmlns:pic="http://schemas.openxmlformats.org/drawingml/2006/picture">
+            <wp:extent cx="4069080" cy="2288857"/>
+            <wp:docPr id="9" name="Picture 9"/>
+            <wp:cNvGraphicFramePr>
+              <a:graphicFrameLocks noChangeAspect="1"/>
+            </wp:cNvGraphicFramePr>
+            <a:graphic>
+              <a:graphicData uri="http://schemas.openxmlformats.org/drawingml/2006/picture">
+                <pic:pic>
+                  <pic:nvPicPr>
+                    <pic:cNvPr id="0" name="three_sensitivity.png"/>
+                    <pic:cNvPicPr/>
+                  </pic:nvPicPr>
+                  <pic:blipFill>
+                    <a:blip r:embed="rId18"/>
+                    <a:stretch>
+                      <a:fillRect/>
+                    </a:stretch>
+                  </pic:blipFill>
+                  <pic:spPr>
+                    <a:xfrm>
+                      <a:off x="0" y="0"/>
+                      <a:ext cx="4069080" cy="2288857"/>
+                    </a:xfrm>
+                    <a:prstGeom prst="rect"/>
+                  </pic:spPr>
+                </pic:pic>
+              </a:graphicData>
+            </a:graphic>
+          </wp:inline>
+        </w:drawing>
+      </w:r>
+    </w:p>
+    <w:p>
+      <w:pPr>
+        <w:pStyle w:val="4"/>
+        <w:spacing w:before="0" w:after="160" w:line="240" w:lineRule="auto"/>
+        <w:jc w:val="center"/>
+      </w:pPr>
+      <w:r>
+        <w:rPr>
+          <w:rFonts w:ascii="Times New Roman" w:hAnsi="Times New Roman" w:eastAsia="宋体"/>
+          <w:b w:val="0"/>
+          <w:sz w:val="21"/>
+        </w:rPr>
+        <w:t>图2-6  三体去质心轨迹差随时间的变化（纵轴为位置差／速度扰动幅值）</w:t>
+      </w:r>
+    </w:p>
+    <w:p>
+      <w:pPr>
+        <w:spacing w:before="0" w:after="0" w:line="400" w:lineRule="exact"/>
+        <w:ind w:firstLine="480"/>
+      </w:pPr>
+      <w:r>
+        <w:rPr>
+          <w:rFonts w:ascii="Times New Roman" w:hAnsi="Times New Roman" w:eastAsia="宋体"/>
+          <w:b w:val="0"/>
+          <w:sz w:val="24"/>
+        </w:rPr>
+        <w:t>验证依据包括牛顿引力模型的守恒关系、质心匀速直线运动、步长收敛与可逆性，以及独立高阶积分器的轨迹对照；相关数值积分与多体方法见文献</w:t>
+      </w:r>
+      <w:r>
+        <w:rPr>
+          <w:rFonts w:ascii="Times New Roman" w:hAnsi="Times New Roman"/>
+          <w:sz w:val="18"/>
+          <w:vertAlign w:val="superscript"/>
+        </w:rPr>
+        <w:t>[4-6,11]</w:t>
+      </w:r>
+      <w:r>
+        <w:rPr>
+          <w:rFonts w:ascii="Times New Roman" w:hAnsi="Times New Roman"/>
+          <w:sz w:val="24"/>
+        </w:rPr>
+        <w:t>。这些证据支持本文给定时段的数值准确性，并不构成对三体系统长期动力学性质的证明。</w:t>
       </w:r>
     </w:p>
     <w:p>
@@ -5880,9 +4778,10 @@
       <w:r>
         <w:rPr>
           <w:rFonts w:ascii="Times New Roman" w:hAnsi="Times New Roman" w:eastAsia="宋体"/>
-          <w:sz w:val="24"/>
-        </w:rPr>
-        <w:t>本文通过由简到繁的算例构建了可重复的轨道验证流程。固定中心力算例与抛物线解析解吻合；二体相对轨道及质心运动满足理论预期；三体计算在给定时段内与独立积分结果一致，并可分辨两档微小速度扰动的响应。在此基础上，等质量八字轨道的周期闭合、T/3 状态置换和 20 周期轨迹对照均支持复现结果。</w:t>
+          <w:b w:val="0"/>
+          <w:sz w:val="24"/>
+        </w:rPr>
+        <w:t>本文依照单体、二体、三体、Figure-8 的顺序完成计算与检验。单体轨道与抛物线解析解吻合；二体相对轨道为椭圆，且质心运动满足理论预期；三体在给定时段内与独立积分结果一致。二体和三体的两档微小速度扰动均产生可分辨的有限时间响应。在此基础上，等质量八字轨道的周期闭合、T/3 状态置换和 20 周期轨迹对照支持复现结果。</w:t>
       </w:r>
     </w:p>
     <w:p>

</xml_diff>

<commit_message>
Add concise research background to report introduction
</commit_message>
<xml_diff>
--- a/docs/三体问题数值计算汇报.docx
+++ b/docs/三体问题数值计算汇报.docx
@@ -177,6 +177,12 @@
       </w:r>
     </w:p>
     <w:p>
+      <w:pPr/>
+      <w:r>
+        <w:t>万有引力定律将各天体的位置与速度联系为初值问题。固定中心力模型可用开普勒轨道检验；孤立二体经质心分解后，也可归约为相对运动。增加到三个相互作用天体后，轨道由耦合方程共同决定，对一般初值通常需要数值积分。此时，图像看似合理并不足以说明计算正确：步长误差、守恒量偏移、质心漂移与初值扰动可能产生不同的轨道变化，需要分别检查。</w:t>
+      </w:r>
+    </w:p>
+    <w:p>
       <w:pPr>
         <w:spacing w:before="0" w:after="0" w:line="400" w:lineRule="exact"/>
         <w:ind w:firstLine="480"/>
@@ -186,7 +192,7 @@
           <w:rFonts w:ascii="Times New Roman" w:hAnsi="Times New Roman" w:eastAsia="宋体"/>
           <w:sz w:val="24"/>
         </w:rPr>
-        <w:t>引力多体运动同时包含可解析检验的简单情形与难以获得通用显式解的复杂情形，适合用于研究数值积分误差。Moore 于 1993 年通过作用量极小化的数值探索发现了包括八字轨道在内的平面多体运动</w:t>
+        <w:t>八字轨道为三体数值研究提供了兼具对称性和周期性的典型对象。Moore 于 1993 年通过作用量极小化的数值探索发现了包括八字轨道在内的平面多体运动</w:t>
       </w:r>
       <w:r>
         <w:rPr>

</xml_diff>

<commit_message>
Polish report prose and abstracts
</commit_message>
<xml_diff>
--- a/docs/三体问题数值计算汇报.docx
+++ b/docs/三体问题数值计算汇报.docx
@@ -61,7 +61,7 @@
           <w:rFonts w:ascii="Times New Roman" w:hAnsi="Times New Roman" w:eastAsia="宋体"/>
           <w:sz w:val="21"/>
         </w:rPr>
-        <w:t>摘要：为检验引力轨道数值解的可信度，本文研究固定中心力、二体及三体初值问题，并复现等质量三体的八字形周期轨道。采用自编四阶龙格—库塔法，通过解析解、守恒量、步长减半、时间反演及独立 DOP853 参考轨迹交叉验证。结果表明，给定单体算例为抛物线；二体相对运动为椭圆，质心作匀速运动；三体在给定时段内出现明显分离，但不足以据此断言永久逃逸或混沌。基本算例与独立参考的最大状态差为 10⁻¹³ 至 10⁻¹² 量级。八字轨道的一周期闭合残差约为 3.90×10⁻⁸，20 周期计算仍保持轨道形态。步长扫描表明，该闭合残差主要受初值与周期有效位数限制。研究强调，应同时考察轨迹误差、守恒量及模型假设，避免仅凭图形或能量守恒判定解的正确性。</w:t>
+        <w:t>摘要：本文按固定中心力、二体和三体的顺序计算引力轨道，并复现等质量三体的八字轨道。程序采用四阶龙格—库塔法，通过解析解、守恒量、步长减半、时间反演和独立的 DOP853 参考轨迹检验结果。给定单体算例得到抛物线；二体在质心系中的相对轨道为椭圆；三体在计算时段内明显分离。基本算例与独立参考的最大状态差处于 10⁻¹³ 至 10⁻¹² 量级。八字轨道的一周期闭合残差约为 3.90×10⁻⁸，计算 20 周期后仍保持八字形态。步长扫描显示，闭合残差的平台主要来自初值和周期的小数精度。这些结果说明给定时段内的数值计算可靠，但有限时间内的分离与闭合轨迹均不足以证明永久逃逸、混沌或长期稳定性。</w:t>
       </w:r>
     </w:p>
     <w:p>
@@ -144,7 +144,7 @@
           <w:rFonts w:ascii="Times New Roman" w:hAnsi="Times New Roman" w:eastAsia="宋体"/>
           <w:sz w:val="21"/>
         </w:rPr>
-        <w:t>Abstract: This study examines the numerical accuracy of planar gravitational trajectories, progressing from motion around a fixed central mass to interacting two-body and three-body systems. A classical fourth-order Runge–Kutta method is implemented in Julia. Its results are assessed using an analytical parabolic solution, conservation laws, step refinement, time reversal, and independently implemented DOP853 reference trajectories. For the prescribed initial conditions, the fixed-center example follows a parabola, while the relative two-body motion is elliptical and its center of mass drifts uniformly. The unequal-mass three-body example exhibits substantial separation during the simulated interval, but this observation alone does not establish permanent escape or chaotic dynamics. Maximum state differences from the independent reference are approximately 10⁻¹³ to 10⁻¹² for the basic examples. Velocity perturbations are examined at two amplitudes after removing center-of-mass motion, separating physical sensitivity from numerical discretization error. The additional experiment reproduces the equal-mass figure-eight solution originally discovered numerically by Moore. Periodicity, cyclic exchange after one third of a period, minimum pairwise separation, and conservation errors are evaluated over one and twenty periods. Refining the time step reduces the difference from the reference trajectory, whereas the one-period closure residual approaches approximately 3.90×10⁻⁸. This plateau is consistent with the finite precision of the published initial state and approximate period. The results demonstrate a reproducible verification procedure while distinguishing numerical agreement from mathematical proof of periodicity, stability, or chaos. Complete source files, reference data, and validation tests accompany the study.</w:t>
+        <w:t>Abstract: This paper computes gravitational trajectories in the order of the fixed-center, two-body, and three-body problems, followed by the equal-mass figure-eight orbit. The calculations use a Julia implementation of the classical fourth-order Runge–Kutta method. We check the results against an analytical orbit where available, an independent DOP853 solution, conservation laws, step refinement, and time reversal. With the prescribed initial conditions, the fixed-center orbit is parabolic. In the two-body case, the relative orbit is elliptical and the center of mass moves uniformly. The three-body trajectories separate over the simulated interval, although this does not establish permanent escape or chaos. For the basic examples, the largest state differences from the independent reference are of order 10⁻¹³ to 10⁻¹². Two small velocity perturbations are also tested in each interacting system after removing its own center-of-mass motion; their effects remain distinguishable from numerical error. For the additional figure-eight case, we examine one-period closure, the cyclic exchange of bodies after one third of a period, minimum pairwise distance, and conservation errors over twenty periods. The orbit retains its figure-eight shape, while the one-period closure residual levels off near 3.90×10⁻⁸. A step-size scan indicates that the plateau is mainly due to the decimal precision of the initial state and period. These checks support the reported trajectories over the stated intervals. They do not, by themselves, prove long-term stability or the existence of an exact periodic orbit.</w:t>
       </w:r>
     </w:p>
     <w:p>
@@ -179,7 +179,7 @@
     <w:p>
       <w:pPr/>
       <w:r>
-        <w:t>万有引力定律将各天体的位置与速度联系为初值问题。固定中心力模型可用开普勒轨道检验；孤立二体经质心分解后，也可归约为相对运动。增加到三个相互作用天体后，轨道由耦合方程共同决定，对一般初值通常需要数值积分。此时，图像看似合理并不足以说明计算正确：步长误差、守恒量偏移、质心漂移与初值扰动可能产生不同的轨道变化，需要分别检查。</w:t>
+        <w:t>固定中心力问题有可供核对的开普勒解；孤立二体可分解为质心运动和相对运动。三体相互作用则把三个天体的轨道耦合在一起，通常需要针对给定初值进行数值积分。判断积分是否可信，不能只看轨迹图：计算步长、守恒量、质心运动和初值扰动都提供了不同的检验线索。</w:t>
       </w:r>
     </w:p>
     <w:p>
@@ -192,7 +192,7 @@
           <w:rFonts w:ascii="Times New Roman" w:hAnsi="Times New Roman" w:eastAsia="宋体"/>
           <w:sz w:val="24"/>
         </w:rPr>
-        <w:t>八字轨道为三体数值研究提供了兼具对称性和周期性的典型对象。Moore 于 1993 年通过作用量极小化的数值探索发现了包括八字轨道在内的平面多体运动</w:t>
+        <w:t>八字轨道是三体问题中一个特别的周期解：三个等质量天体沿同一条八字曲线依次运动。Moore 于 1993 年通过数值探索发现这一轨道</w:t>
       </w:r>
       <w:r>
         <w:rPr>
@@ -207,7 +207,7 @@
           <w:rFonts w:ascii="Times New Roman" w:hAnsi="Times New Roman" w:eastAsia="宋体"/>
           <w:sz w:val="24"/>
         </w:rPr>
-        <w:t>；Chenciner 与 Montgomery 后来给出了等质量三体八字解的存在性证明</w:t>
+        <w:t>；Chenciner 与 Montgomery 后来证明了它的存在性</w:t>
       </w:r>
       <w:r>
         <w:rPr>
@@ -222,7 +222,7 @@
           <w:rFonts w:ascii="Times New Roman" w:hAnsi="Times New Roman" w:eastAsia="宋体"/>
           <w:sz w:val="24"/>
         </w:rPr>
-        <w:t>。后续稳定性与分岔研究表明，周期轨道的动力学性质需要专门分析</w:t>
+        <w:t>。关于其稳定性和分岔，后续还有专门研究</w:t>
       </w:r>
       <w:r>
         <w:rPr>
@@ -237,7 +237,7 @@
           <w:rFonts w:ascii="Times New Roman" w:hAnsi="Times New Roman" w:eastAsia="宋体"/>
           <w:sz w:val="24"/>
         </w:rPr>
-        <w:t>。因此，画出闭合曲线并不能替代正确性或稳定性论证。</w:t>
+        <w:t>。因此，轨迹在图上闭合，并不等于已经证明它长期稳定。</w:t>
       </w:r>
     </w:p>
     <w:p>
@@ -310,7 +310,7 @@
           <w:rFonts w:ascii="Times New Roman" w:hAnsi="Times New Roman" w:eastAsia="宋体"/>
           <w:sz w:val="24"/>
         </w:rPr>
-        <w:t>。这些资源为后续交叉验证提供条件。本文以课堂初值为对象，先完成单体、二体、三体基本任务，再开展八字解复现；REBOUND、IAS15 与 DifferentialEquations.jl 仅作为相关工作，本次独立对照实际使用 SciPy DOP853。</w:t>
+        <w:t>。这些工作说明三体计算已有多种成熟工具，但本报告仍从课堂初值和自编 RK4 程序出发，按单体、二体、三体的顺序验证，最后复现八字轨道。REBOUND、IAS15 和 DifferentialEquations.jl 只用于介绍相关工作；实际的独立对照采用 SciPy DOP853。</w:t>
       </w:r>
     </w:p>
     <w:p>
@@ -1119,7 +1119,7 @@
           <w:rFonts w:ascii="Times New Roman" w:hAnsi="Times New Roman" w:eastAsia="宋体"/>
           <w:sz w:val="24"/>
         </w:rPr>
-        <w:t>力函数按物体对计算距离与引力项，并组装式（1-1）。RK4 在光滑且远离碰撞的情形下具有四阶全局收敛性；当步长已足够小时，继续减小步长可能进入舍入误差主导区，不能要求误差始终按 16 倍下降。</w:t>
+        <w:t>程序逐对计算天体间的引力，再按式（1-1）组装各天体的加速度。对光滑且远离碰撞的轨道，RK4 的全局误差随步长呈四阶下降；步长很小时，舍入误差会逐渐显现，误差不一定继续按预期比例下降。</w:t>
       </w:r>
     </w:p>
     <w:p>
@@ -1773,7 +1773,7 @@
           <w:rFonts w:ascii="Times New Roman" w:hAnsi="Times New Roman" w:eastAsia="宋体"/>
           <w:sz w:val="24"/>
         </w:rPr>
-        <w:t>参考差定义为相同采样时刻、所有无量纲状态分量绝对差的最大值。基本任务参考采样间隔为 0.1；守恒量在主积分的全部步上检查。DOP853 使用 rtol=3×10⁻¹⁴、atol=3×10⁻¹⁶，并与较宽容差结果比较。参考解仍有离散与舍入误差，因此两种积分器的一致性不构成严格误差上界。</w:t>
+        <w:t>本文将同一采样时刻所有无量纲状态分量的最大绝对差记为参考差。基本算例每隔 0.1 采样一次，守恒量则在主积分的每一步检查。DOP853 的容差设为 rtol=3×10⁻¹⁴、atol=3×10⁻¹⁶，并用较宽容差再算一次。参考轨迹也受离散和舍入误差影响，两种算法吻合不能视为严格的误差上界。</w:t>
       </w:r>
     </w:p>
     <w:p>
@@ -3024,7 +3024,7 @@
           <w:b w:val="0"/>
           <w:sz w:val="24"/>
         </w:rPr>
-        <w:t>正确性检验：RK4 与解析完整状态的最大差为 4.14×10⁻¹³；与独立 DOP853 的最大状态差为 1.51×10⁻¹³；h 从 0.001 减半后的最大状态差为 2.31×10⁻¹³；时间反演误差为 1.33×10⁻¹⁵。四项检验共同支持图 2-1 的数值结果。</w:t>
+        <w:t>RK4 与解析解的完整状态最大相差 4.14×10⁻¹³，与独立 DOP853 轨迹最大相差 1.51×10⁻¹³。将步长从 0.001 减半，两次结果的最大差为 2.31×10⁻¹³；时间反演误差为 1.33×10⁻¹⁵。这些数值与图 2-1 中两条轨迹的重合相符。</w:t>
       </w:r>
     </w:p>
     <w:p>
@@ -3143,7 +3143,7 @@
           <w:b w:val="0"/>
           <w:sz w:val="24"/>
         </w:rPr>
-        <w:t>正确性检验：与独立 DOP853 的最大状态差为 1.57×10⁻¹³，步长减半差为 1.98×10⁻¹³，时间反演误差为 6.76×10⁻¹⁵。全步能量、动量、角动量及质心直线运动的最大偏差分别约为 9.54×10⁻¹⁷、4.30×10⁻¹⁶、1.39×10⁻¹⁵ 和 3.20×10⁻¹⁴。</w:t>
+        <w:t>与独立 DOP853 轨迹相比，最大状态差为 1.57×10⁻¹³；步长减半差为 1.98×10⁻¹³，时间反演误差为 6.76×10⁻¹⁵。全部积分步上，能量、动量、角动量和质心直线运动的最大偏差依次约为 9.54×10⁻¹⁷、4.30×10⁻¹⁶、1.39×10⁻¹⁵ 和 3.20×10⁻¹⁴。</w:t>
       </w:r>
     </w:p>
     <w:p>
@@ -3157,7 +3157,7 @@
           <w:b w:val="0"/>
           <w:sz w:val="24"/>
         </w:rPr>
-        <w:t>将第二体初始 y 方向速度分别增加 10⁻⁶ 与 10⁻⁸。去除两次计算各自的质心平动后，在 T=20 时全体位置差的欧氏范数分别为 2.619520×10⁻⁵ 与 2.619521×10⁻⁷。图 2-3 给出位置差除以扰动幅值后的时间变化，两档曲线接近；扰动信号的步长减半差约为 10⁻¹³，远小于实际响应。</w:t>
+        <w:t>分别将第二体初始 y 方向速度增加 10⁻⁶ 和 10⁻⁸。扣除各自的质心平动后，T=20 时全体位置差的欧氏范数分别为 2.619520×10⁻⁵ 和 2.619521×10⁻⁷。图 2-3 将位置差除以对应的扰动幅值；两条曲线基本重合。扰动信号的步长减半差约为 10⁻¹³，明显小于观测到的响应。</w:t>
       </w:r>
     </w:p>
     <w:p>
@@ -3391,7 +3391,7 @@
           <w:b w:val="0"/>
           <w:sz w:val="24"/>
         </w:rPr>
-        <w:t>正确性检验：与独立 DOP853 的最大状态差为 1.47×10⁻¹²，步长减半差为 1.34×10⁻¹³，时间反演误差为 5.31×10⁻¹⁵。全步能量、动量、角动量及质心运动偏差分别约为 3.59×10⁻¹⁶、8.19×10⁻¹⁶、3.44×10⁻¹⁵ 和 3.91×10⁻¹⁴。与二体相同，守恒检验还需结合独立轨迹对照与步长收敛判断。</w:t>
+        <w:t>三体轨迹与独立 DOP853 结果的最大状态差为 1.47×10⁻¹²；步长减半差为 1.34×10⁻¹³，时间反演误差为 5.31×10⁻¹⁵。全部积分步上，能量、动量、角动量和质心运动的最大偏差依次约为 3.59×10⁻¹⁶、8.19×10⁻¹⁶、3.44×10⁻¹⁵ 和 3.91×10⁻¹⁴。守恒量的变化很小，独立轨迹与步长检验也给出一致结果。</w:t>
       </w:r>
     </w:p>
     <w:p>
@@ -3405,7 +3405,7 @@
           <w:b w:val="0"/>
           <w:sz w:val="24"/>
         </w:rPr>
-        <w:t>将第三体初始 x 方向速度分别增加 10⁻⁶ 与 10⁻⁸，并在各自质心系比较轨迹。在 T=30 时，全体位置差分别为 3.398810×10⁻⁵ 与 3.398811×10⁻⁷；图 2-6 给出差值按扰动幅值归一化后的变化。两档响应近似线性缩放，且相应的步长减半差约为 10⁻¹³。本实验只验证有限时间内可分辨的初值响应，未计算收敛的 Lyapunov 指数。</w:t>
+        <w:t>分别将第三体初始 x 方向速度增加 10⁻⁶ 和 10⁻⁸，并在各自质心系中比较轨迹。T=30 时，全体位置差分别为 3.398810×10⁻⁵ 和 3.398811×10⁻⁷。图 2-6 显示，按扰动幅值归一化后，两档响应几乎重合；对应的步长减半差约为 10⁻¹³。这里观察的是有限时间内的初值响应，尚未计算 Lyapunov 指数。</w:t>
       </w:r>
     </w:p>
     <w:p>
@@ -3476,7 +3476,7 @@
           <w:b w:val="0"/>
           <w:sz w:val="24"/>
         </w:rPr>
-        <w:t>验证依据包括牛顿引力模型的守恒关系、质心匀速直线运动、步长收敛与可逆性，以及独立高阶积分器的轨迹对照；相关数值积分与多体方法见文献</w:t>
+        <w:t>本算例的检验依据是能量、动量和角动量守恒，质心匀速直线运动，步长减半、时间反演，以及独立 DOP853 轨迹对照；数值积分与多体方法可参见文献</w:t>
       </w:r>
       <w:r>
         <w:rPr>
@@ -3491,7 +3491,7 @@
           <w:rFonts w:ascii="Times New Roman" w:hAnsi="Times New Roman"/>
           <w:sz w:val="24"/>
         </w:rPr>
-        <w:t>。这些证据支持本文给定时段的数值准确性，并不构成对三体系统长期动力学性质的证明。</w:t>
+        <w:t>。这些检验支持给定时段内的计算结果，无法单独说明三体系统的长期运动。</w:t>
       </w:r>
     </w:p>
     <w:p>
@@ -3534,7 +3534,7 @@
           <w:rFonts w:ascii="Times New Roman" w:hAnsi="Times New Roman" w:eastAsia="宋体"/>
           <w:sz w:val="24"/>
         </w:rPr>
-        <w:t>本节复现 Moore 所发现的 figure-eight solution，即三个等质量质点沿同一八字曲线依次运动的解</w:t>
+        <w:t>本节复现三个等质量天体沿同一八字曲线依次运动的周期解</w:t>
       </w:r>
       <w:r>
         <w:rPr>
@@ -3549,7 +3549,7 @@
           <w:rFonts w:ascii="Times New Roman" w:hAnsi="Times New Roman" w:eastAsia="宋体"/>
           <w:sz w:val="24"/>
         </w:rPr>
-        <w:t>，不复现其寻找轨道的作用量极小化算法。数值初值采用 GeometricProblems.jl 的公开三体示例</w:t>
+        <w:t>。这里计算轨道本身，不重做 Moore 寻找轨道时使用的作用量极小化过程。初值取自 GeometricProblems.jl 的公开三体示例</w:t>
       </w:r>
       <w:r>
         <w:rPr>
@@ -3564,7 +3564,7 @@
           <w:rFonts w:ascii="Times New Roman" w:hAnsi="Times New Roman" w:eastAsia="宋体"/>
           <w:sz w:val="24"/>
         </w:rPr>
-        <w:t>并按本文编号重排。该示例是具体数值的来源，不能把这些小数直接归为 Moore 论文给出的参数。</w:t>
+        <w:t>，并按本文的物体编号重排。表中的小数来自该示例，不能直接写成 Moore 论文给出的初值。</w:t>
       </w:r>
     </w:p>
     <w:p>
@@ -4002,7 +4002,7 @@
           <w:rFonts w:ascii="Times New Roman" w:hAnsi="Times New Roman" w:eastAsia="宋体"/>
           <w:sz w:val="24"/>
         </w:rPr>
-        <w:t>按每周期 300 至 9600 步扫描。周期闭合残差为末态与初态的最大分量差，参考差为相同初值的 RK4 与 DOP853 在公共网格上的最大分量差，两者检验对象不同。</w:t>
+        <w:t>将每周期步数从 300 逐次增加到 9600。周期闭合残差取末态与初态的最大分量差；参考差取同一初值下 RK4 和 DOP853 在公共网格上的最大分量差。前者检查闭合程度，后者检查两种算法的一致性。</w:t>
       </w:r>
     </w:p>
     <w:p>
@@ -4557,7 +4557,7 @@
           <w:rFonts w:ascii="Times New Roman" w:hAnsi="Times New Roman" w:eastAsia="宋体"/>
           <w:sz w:val="24"/>
         </w:rPr>
-        <w:t>细化步长后参考差持续降低，而闭合残差停留在约 3.90×10⁻⁸；独立参考轨迹自身的一周期闭合残差也约为 3.90×10⁻⁸。因此该平台与给定初值、周期的小数截断一致，不能解释为 RK4 不收敛。每周期 600 步处闭合残差偶然较小也不代表更准确。</w:t>
+        <w:t>步长减小时，RK4 与 DOP853 的参考差持续下降，周期闭合残差却停在约 3.90×10⁻⁸。DOP853 自身的一周期闭合残差也约为 3.90×10⁻⁸，说明这一平台与初值及周期的小数截断相符，不能据此判断 RK4 不收敛。每周期 600 步时的闭合残差虽偶然较小，参考差并未同步达到最小。</w:t>
       </w:r>
     </w:p>
     <w:p>
@@ -4598,7 +4598,7 @@
           <w:rFonts w:ascii="Times New Roman" w:hAnsi="Times New Roman" w:eastAsia="宋体"/>
           <w:sz w:val="24"/>
         </w:rPr>
-        <w:t>取 h=T/2400 积分 20 周期，位置闭合残差约为 5.75×10⁻⁷，速度闭合残差约为 7.49×10⁻⁷；相同初值下与独立参考的最大状态差约为 2.24×10⁻⁸。全程能量绝对漂移不超过约 8.62×10⁻¹¹，最小两体距离约为 0.69053。收紧参考容差引起的轨迹差约为 5.22×10⁻⁹，说明长时间对照亦应报告参考自身的不确定性。</w:t>
+        <w:t>以 h=T/2400 积分 20 周期后，位置和速度的闭合残差分别约为 5.75×10⁻⁷ 和 7.49×10⁻⁷；与独立参考轨迹的最大状态差约为 2.24×10⁻⁸。全程能量绝对漂移不超过约 8.62×10⁻¹¹，最小两体距离约为 0.69053。将参考轨迹的容差进一步收紧，两次参考结果相差约 5.22×10⁻⁹，因此长时间对照也需考虑参考解自身的误差。</w:t>
       </w:r>
     </w:p>
     <w:p>
@@ -4673,7 +4673,7 @@
           <w:rFonts w:ascii="Times New Roman" w:hAnsi="Times New Roman" w:eastAsia="宋体"/>
           <w:sz w:val="24"/>
         </w:rPr>
-        <w:t>图 3-2 同时展示积分误差、周期闭合和局部相位投影。局部相位估计将位置误差投影到参考速度方向，仅用于区分沿轨迹与横向偏离，并非全局相位的精确重建。20 周期内保持轨道形态不等于证明无限时间稳定性；严格的轨道存在性与稳定性论证应与文献中的变分理论和特征乘子分析区分</w:t>
+        <w:t>图 3-2 给出积分误差、周期闭合残差和局部相位投影。相位投影把位置误差分解到参考速度方向，只用来区分沿轨道与横向的偏离，不是对全局相位的精确重建。积分 20 周期后仍呈八字形，也不能据此断言轨道在无限时间内稳定；相关的存在性证明和稳定性分析见文献</w:t>
       </w:r>
       <w:r>
         <w:rPr>
@@ -4758,7 +4758,7 @@
           <w:rFonts w:ascii="Times New Roman" w:hAnsi="Times New Roman" w:eastAsia="宋体"/>
           <w:sz w:val="24"/>
         </w:rPr>
-        <w:t>仓库提供不含运行输出的 Notebook、可维护源文件、Julia 环境声明、Python 依赖文件及参考数据的 SHA-256 校验值。主程序生成图表，参考脚本以独立的成对引力实现生成 DOP853 数据。数值结果保存为 TOML 文件，便于逐项核对。本次独立项目通过 23 项 Julia 数值检查及 3 项 Python 交付一致性检查。具体安装与执行步骤见仓库 README。</w:t>
+        <w:t>仓库保存了 Notebook、源文件、Julia 环境声明、Python 依赖文件和参考数据的 SHA-256 校验值，不包含程序运行输出。主程序负责计算与绘图；参考脚本独立实现成对引力，并生成 DOP853 对照数据。结果以 TOML 文件保存，安装和运行方法见 README。项目已通过 23 项 Julia 数值检查和 3 项 Python 交付检查。</w:t>
       </w:r>
     </w:p>
     <w:p>
@@ -4787,7 +4787,7 @@
           <w:b w:val="0"/>
           <w:sz w:val="24"/>
         </w:rPr>
-        <w:t>本文依照单体、二体、三体、Figure-8 的顺序完成计算与检验。单体轨道与抛物线解析解吻合；二体相对轨道为椭圆，且质心运动满足理论预期；三体在给定时段内与独立积分结果一致。二体和三体的两档微小速度扰动均产生可分辨的有限时间响应。在此基础上，等质量八字轨道的周期闭合、T/3 状态置换和 20 周期轨迹对照支持复现结果。</w:t>
+        <w:t>按老师给定的顺序，本文先计算单体、二体和三体，再复现八字轨道。单体数值轨迹与抛物线解析解吻合；二体在质心系中的相对运动为椭圆；三体在给定时段内与独立积分结果一致。二体和三体的两档微小速度扰动均产生了高于数值误差的轨迹差。等质量八字算例还满足近似周期闭合与 T/3 状态置换，积分 20 周期后仍可辨认其轨道形态。</w:t>
       </w:r>
     </w:p>
     <w:p>
@@ -4800,7 +4800,7 @@
           <w:rFonts w:ascii="Times New Roman" w:hAnsi="Times New Roman" w:eastAsia="宋体"/>
           <w:sz w:val="24"/>
         </w:rPr>
-        <w:t>本研究仍采用有限精度初值和有限积分时间。后续可用高精度射击法联合修正初值与周期，降低闭合残差平台；通过变分方程与特征乘子研究局部稳定性；在相同误差预算下比较 RK4、辛积分与 IAS15 的计算成本，并为近碰撞情形引入事件检测和适当正则化。</w:t>
+        <w:t>现有计算受初值精度和积分时长限制。若要进一步减小八字轨道的闭合残差，可用高精度射击法同时修正初值与周期；若要判断局部稳定性，则需积分变分方程并计算特征乘子。近碰撞轨道还需要事件检测或正则化处理。</w:t>
       </w:r>
     </w:p>
     <w:p>

</xml_diff>

<commit_message>
Show complete two-body orbit and extended three-body trajectories
</commit_message>
<xml_diff>
--- a/docs/三体问题数值计算汇报.docx
+++ b/docs/三体问题数值计算汇报.docx
@@ -34,7 +34,7 @@
           <w:b w:val="0"/>
           <w:sz w:val="24"/>
         </w:rPr>
-        <w:t>张志杨</w:t>
+        <w:t>匿名作者</w:t>
       </w:r>
     </w:p>
     <w:p>
@@ -48,7 +48,7 @@
           <w:b w:val="0"/>
           <w:sz w:val="21"/>
         </w:rPr>
-        <w:t>（天津大学机械工程学院；工程力学强基班；学号 3024201037）</w:t>
+        <w:t>（天津大学机械工程学院；工程力学强基班；学号已省略）</w:t>
       </w:r>
     </w:p>
     <w:p>
@@ -61,7 +61,7 @@
           <w:rFonts w:ascii="Times New Roman" w:hAnsi="Times New Roman" w:eastAsia="宋体"/>
           <w:sz w:val="21"/>
         </w:rPr>
-        <w:t>摘要：本文按固定中心力、二体和三体的顺序计算引力轨道，并复现等质量三体的八字轨道。程序采用四阶龙格—库塔法，通过解析解、守恒量、步长减半、时间反演和独立的 DOP853 参考轨迹检验结果。给定单体算例得到抛物线；二体在质心系中的相对轨道为椭圆；三体在计算时段内明显分离。基本算例与独立参考的最大状态差处于 10⁻¹³ 至 10⁻¹² 量级。八字轨道的一周期闭合残差约为 3.90×10⁻⁸，计算 20 周期后仍保持八字形态。步长扫描显示，闭合残差的平台主要来自初值和周期的小数精度。这些结果说明给定时段内的数值计算可靠，但有限时间内的分离与闭合轨迹均不足以证明永久逃逸、混沌或长期稳定性。</w:t>
+        <w:t>摘要：本文按固定中心力、二体和三体的顺序计算引力轨道，并复现等质量三体的八字轨道。程序采用四阶龙格—库塔法，通过解析解、守恒量、步长减半、时间反演和独立的 DOP853 参考轨迹检验结果。给定单体算例得到抛物线；二体在质心系中的相对轨道为椭圆，延长计算后显示完整一周；三体延长至 T=200 时，第三体与前两体的距离均超过 84。基本算例与独立参考的最大状态差处于 10⁻¹³ 至 10⁻¹² 量级。八字轨道的一周期闭合残差约为 3.90×10⁻⁸，计算 20 周期后仍保持八字形态。步长扫描显示，闭合残差的平台主要来自初值和周期的小数精度。</w:t>
       </w:r>
     </w:p>
     <w:p>
@@ -95,7 +95,7 @@
           <w:rFonts w:ascii="Times New Roman" w:hAnsi="Times New Roman" w:eastAsia="宋体"/>
           <w:sz w:val="28"/>
         </w:rPr>
-        <w:br w:type="textWrapping"/>
+        <w:br/>
       </w:r>
       <w:r>
         <w:rPr>
@@ -116,7 +116,7 @@
           <w:b w:val="0"/>
           <w:sz w:val="21"/>
         </w:rPr>
-        <w:t>ZHANG Zhiyang</w:t>
+        <w:t>Anonymous Author</w:t>
       </w:r>
     </w:p>
     <w:p>
@@ -131,7 +131,7 @@
           <w:i/>
           <w:sz w:val="21"/>
         </w:rPr>
-        <w:t>(School of Mechanical Engineering, Tianjin University; Engineering Mechanics; Student ID 3024201037)</w:t>
+        <w:t>(School of Mechanical Engineering, Tianjin University; Engineering Mechanics; Student ID omitted)</w:t>
       </w:r>
     </w:p>
     <w:p>
@@ -144,7 +144,7 @@
           <w:rFonts w:ascii="Times New Roman" w:hAnsi="Times New Roman" w:eastAsia="宋体"/>
           <w:sz w:val="21"/>
         </w:rPr>
-        <w:t>Abstract: This paper computes gravitational trajectories in the order of the fixed-center, two-body, and three-body problems, followed by the equal-mass figure-eight orbit. The calculations use a Julia implementation of the classical fourth-order Runge–Kutta method. We check the results against an analytical orbit where available, an independent DOP853 solution, conservation laws, step refinement, and time reversal. With the prescribed initial conditions, the fixed-center orbit is parabolic. In the two-body case, the relative orbit is elliptical and the center of mass moves uniformly. The three-body trajectories separate over the simulated interval, although this does not establish permanent escape or chaos. For the basic examples, the largest state differences from the independent reference are of order 10⁻¹³ to 10⁻¹². Two small velocity perturbations are also tested in each interacting system after removing its own center-of-mass motion; their effects remain distinguishable from numerical error. For the additional figure-eight case, we examine one-period closure, the cyclic exchange of bodies after one third of a period, minimum pairwise distance, and conservation errors over twenty periods. The orbit retains its figure-eight shape, while the one-period closure residual levels off near 3.90×10⁻⁸. A step-size scan indicates that the plateau is mainly due to the decimal precision of the initial state and period. These checks support the reported trajectories over the stated intervals. They do not, by themselves, prove long-term stability or the existence of an exact periodic orbit.</w:t>
+        <w:t>Abstract: This paper computes gravitational trajectories in the order of the fixed-center, two-body, and three-body problems, followed by the equal-mass figure-eight orbit. The calculations use a Julia implementation of the classical fourth-order Runge–Kutta method. Results are checked against an analytical orbit where available, an independent DOP853 solution, conservation laws, step refinement, and time reversal. With the prescribed initial conditions, the fixed-center orbit is parabolic. The relative two-body orbit is elliptical; an extended calculation displays one complete revolution. In the three-body case, the third body is more than 84 length units from each of the other two at t=200. For the basic validation intervals, the largest state differences from the independent reference are of order 10⁻¹³ to 10⁻¹². Two small velocity perturbations are tested in each interacting system after removing its own center-of-mass motion; their effects remain distinguishable from numerical error. For the additional figure-eight case, we examine one-period closure, the cyclic exchange of bodies after one third of a period, minimum pairwise distance, and conservation errors over twenty periods. The orbit retains its figure-eight shape, while the one-period closure residual levels off near 3.90×10⁻⁸. A step-size scan indicates that the plateau is mainly due to the decimal precision of the initial state and period.</w:t>
       </w:r>
     </w:p>
     <w:p>
@@ -179,7 +179,7 @@
     <w:p>
       <w:pPr/>
       <w:r>
-        <w:t>固定中心力问题有可供核对的开普勒解；孤立二体可分解为质心运动和相对运动。三体相互作用则把三个天体的轨道耦合在一起，通常需要针对给定初值进行数值积分。判断积分是否可信，不能只看轨迹图：计算步长、守恒量、质心运动和初值扰动都提供了不同的检验线索。</w:t>
+        <w:t>固定中心力问题有可供核对的开普勒解；孤立二体可分解为质心运动和相对运动。三体相互作用则把三个天体的轨道耦合在一起，通常需要针对给定初值进行数值积分。判断积分是否可信，应同时检查轨迹图、计算步长、守恒量、质心运动和初值扰动。</w:t>
       </w:r>
     </w:p>
     <w:p>
@@ -237,7 +237,7 @@
           <w:rFonts w:ascii="Times New Roman" w:hAnsi="Times New Roman" w:eastAsia="宋体"/>
           <w:sz w:val="24"/>
         </w:rPr>
-        <w:t>。因此，轨迹在图上闭合，并不等于已经证明它长期稳定。</w:t>
+        <w:t>。本文以闭合残差和循环置换误差检验数值复现结果。</w:t>
       </w:r>
     </w:p>
     <w:p>
@@ -1773,7 +1773,7 @@
           <w:rFonts w:ascii="Times New Roman" w:hAnsi="Times New Roman" w:eastAsia="宋体"/>
           <w:sz w:val="24"/>
         </w:rPr>
-        <w:t>本文将同一采样时刻所有无量纲状态分量的最大绝对差记为参考差。基本算例每隔 0.1 采样一次，守恒量则在主积分的每一步检查。DOP853 的容差设为 rtol=3×10⁻¹⁴、atol=3×10⁻¹⁶，并用较宽容差再算一次。参考轨迹也受离散和舍入误差影响，两种算法吻合不能视为严格的误差上界。</w:t>
+        <w:t>本文将同一采样时刻所有无量纲状态分量的最大绝对差记为参考差。基本算例每隔 0.1 采样一次，守恒量则在主积分的每一步检查。DOP853 的容差设为 rtol=3×10⁻¹⁴、atol=3×10⁻¹⁶，并用较宽容差再算一次。参考轨迹也受离散和舍入误差影响，本文将两种算法的差值作为数值一致性指标。</w:t>
       </w:r>
     </w:p>
     <w:p>
@@ -3053,7 +3053,7 @@
           <w:b w:val="0"/>
           <w:sz w:val="24"/>
         </w:rPr>
-        <w:t>取 m₁=0.30、m₂=0.03，初始位置分别为 (2,2)、(0,0)，初始速度分别为 (0.2,−0.2)、(−0.01,0.01)，积分至 T=20。初始总动量 P₀=(0.0597,−0.0597)，故惯性系轨迹含质心平动；图 2-2 在各自质心系中显示相对轨道。</w:t>
+        <w:t>取 m₁=0.30、m₂=0.03，初始位置分别为 (2,2)、(0,0)，初始速度分别为 (0.2,−0.2)、(−0.01,0.01)。基本验证与扰动分析使用 T=20；为画出一整周相对轨道，图 2-2 将同一初值延长积分至 T=40。初始总动量 P₀=(0.0597,−0.0597)，因此图中采用质心系坐标。</w:t>
       </w:r>
     </w:p>
     <w:p>
@@ -3067,7 +3067,7 @@
           <w:b w:val="0"/>
           <w:sz w:val="24"/>
         </w:rPr>
-        <w:t>去除质心平动后，内部能量为 −0.00197925，半长轴约 2.273585、偏心率约 0.244039、周期约 37.4964，故相对运动为椭圆。总能量虽为正值 0.00882102，但包含整体平动能；T=20 尚未覆盖一整周，不能以图线未闭合判断积分失败。</w:t>
+        <w:t>去除质心平动后，内部能量为 −0.00197925，半长轴约 2.273585、偏心率约 0.244039、周期约 37.4964。图 2-2 显示两体在 T=40 内完成一周多的椭圆运动，星形标记对应原验证终点 T=20。总能量 0.00882102 包含整体平动能；判断相对轨道形状时采用内部能量。</w:t>
       </w:r>
     </w:p>
     <w:p>
@@ -3080,7 +3080,7 @@
       <w:r>
         <w:drawing>
           <wp:inline distT="0" distB="0" distL="114300" distR="114300">
-            <wp:extent cx="4139565" cy="2759710"/>
+            <wp:extent cx="4572000" cy="3302000"/>
             <wp:effectExtent l="0" t="0" r="635" b="8890"/>
             <wp:docPr id="2" name="Picture 2" descr="图2-2  二体运动的质心系轨迹"/>
             <wp:cNvGraphicFramePr>
@@ -3104,7 +3104,7 @@
                   <pic:spPr>
                     <a:xfrm>
                       <a:off x="0" y="0"/>
-                      <a:ext cx="4140000" cy="2760000"/>
+                      <a:ext cx="4572000" cy="3302000"/>
                     </a:xfrm>
                     <a:prstGeom prst="rect">
                       <a:avLst/>
@@ -3129,7 +3129,7 @@
           <w:rFonts w:ascii="Times New Roman" w:hAnsi="Times New Roman" w:eastAsia="宋体"/>
           <w:sz w:val="21"/>
         </w:rPr>
-        <w:t>图2-2  二体运动的质心系轨迹</w:t>
+        <w:t>图2-2  二体质心系完整相对轨道（0≤t≤40；圆点、星号、菱形分别为 t=0、20、40）</w:t>
       </w:r>
     </w:p>
     <w:p>
@@ -3243,7 +3243,7 @@
           <w:b w:val="0"/>
           <w:sz w:val="24"/>
         </w:rPr>
-        <w:t>取 m₁=0.30、m₂=m₃=0.03，初始位置依次为 (2,2)、(0,0)、(−2,−2)，初始速度依次为 (0.2,−0.2)、(0,0)、(−0.2,0.2)，积分至 T=30。初始质心为 (1.5,1.5)，质心速度为 (0.15,−0.15)；图 2-4 给出质心系运动轨迹。</w:t>
+        <w:t>取 m₁=0.30、m₂=m₃=0.03，初始位置依次为 (2,2)、(0,0)、(−2,−2)，初始速度依次为 (0.2,−0.2)、(0,0)、(−0.2,0.2)。基本验证与扰动分析使用 T=30；图 2-4 将相同初值的轨迹延长至 T=200，并列出前 30 时间单位的局部图。初始质心为 (1.5,1.5)，质心速度为 (0.15,−0.15)。</w:t>
       </w:r>
     </w:p>
     <w:p>
@@ -3256,7 +3256,7 @@
       <w:r>
         <w:drawing>
           <wp:inline distT="0" distB="0" distL="114300" distR="114300">
-            <wp:extent cx="4139565" cy="2759710"/>
+            <wp:extent cx="5166360" cy="2066544"/>
             <wp:effectExtent l="0" t="0" r="635" b="8890"/>
             <wp:docPr id="3" name="Picture 3" descr="图2-3  三体运动的质心系轨迹"/>
             <wp:cNvGraphicFramePr>
@@ -3280,7 +3280,7 @@
                   <pic:spPr>
                     <a:xfrm>
                       <a:off x="0" y="0"/>
-                      <a:ext cx="4140000" cy="2760000"/>
+                      <a:ext cx="5166360" cy="2066544"/>
                     </a:xfrm>
                     <a:prstGeom prst="rect">
                       <a:avLst/>
@@ -3306,7 +3306,7 @@
           <w:b w:val="0"/>
           <w:sz w:val="21"/>
         </w:rPr>
-        <w:t>图2-4  三体运动的质心系轨迹</w:t>
+        <w:t>图2-4  三体质心系轨迹：0≤t≤200 总览与 0≤t≤30 局部（圆点为起点，菱形为终点）</w:t>
       </w:r>
     </w:p>
     <w:p>
@@ -3320,7 +3320,7 @@
           <w:b w:val="0"/>
           <w:sz w:val="24"/>
         </w:rPr>
-        <w:t>在 T=30 时，三组两体距离约为 2.5783、14.5385、15.3203，距离变化见图 2-5；全步最小两体距离约为 1.4621。总能量约 0.00810883，内部能量约 8.83118×10⁻⁶。第三体在观测时段内远离前两体，但有限时间轨迹尚不能证明永久逃逸，也不能直接证明混沌。</w:t>
+        <w:t>在 T=30 时，三组两体距离约为 2.5783、14.5385、15.3203；该时段的最小两体距离约为 1.4621。继续积分至 T=200，三组距离依次为 2.7179、84.0268、84.9222，变化过程见图 2-5。前两体保持在相近区域运动，第三体逐渐远离。T=200 时步长减半得到的最大状态差为 4.12×10⁻¹¹。初始总能量约为 0.00810883，内部能量约为 8.83118×10⁻⁶。</w:t>
       </w:r>
     </w:p>
     <w:p>
@@ -3333,7 +3333,7 @@
       <w:r>
         <w:drawing>
           <wp:inline xmlns:a="http://schemas.openxmlformats.org/drawingml/2006/main" xmlns:pic="http://schemas.openxmlformats.org/drawingml/2006/picture">
-            <wp:extent cx="3886200" cy="2590800"/>
+            <wp:extent cx="4846320" cy="2326233"/>
             <wp:docPr id="8" name="Picture 8"/>
             <wp:cNvGraphicFramePr>
               <a:graphicFrameLocks noChangeAspect="1"/>
@@ -3354,7 +3354,7 @@
                   <pic:spPr>
                     <a:xfrm>
                       <a:off x="0" y="0"/>
-                      <a:ext cx="3886200" cy="2590800"/>
+                      <a:ext cx="4846320" cy="2326233"/>
                     </a:xfrm>
                     <a:prstGeom prst="rect"/>
                   </pic:spPr>
@@ -3377,7 +3377,7 @@
           <w:b w:val="0"/>
           <w:sz w:val="21"/>
         </w:rPr>
-        <w:t>图2-5  三体算例中三组两体距离随时间的变化</w:t>
+        <w:t>图2-5  三组两体距离在 0≤t≤200 内的变化（虚线为原验证终点 t=30）</w:t>
       </w:r>
     </w:p>
     <w:p>
@@ -3405,7 +3405,7 @@
           <w:b w:val="0"/>
           <w:sz w:val="24"/>
         </w:rPr>
-        <w:t>分别将第三体初始 x 方向速度增加 10⁻⁶ 和 10⁻⁸，并在各自质心系中比较轨迹。T=30 时，全体位置差分别为 3.398810×10⁻⁵ 和 3.398811×10⁻⁷。图 2-6 显示，按扰动幅值归一化后，两档响应几乎重合；对应的步长减半差约为 10⁻¹³。这里观察的是有限时间内的初值响应，尚未计算 Lyapunov 指数。</w:t>
+        <w:t>分别将第三体初始 x 方向速度增加 10⁻⁶ 和 10⁻⁸，并在各自质心系中比较轨迹。T=30 时，全体位置差分别为 3.398810×10⁻⁵ 和 3.398811×10⁻⁷。图 2-6 显示，按扰动幅值归一化后，两档响应几乎重合；对应的步长减半差约为 10⁻¹³。</w:t>
       </w:r>
     </w:p>
     <w:p>
@@ -3491,7 +3491,7 @@
           <w:rFonts w:ascii="Times New Roman" w:hAnsi="Times New Roman"/>
           <w:sz w:val="24"/>
         </w:rPr>
-        <w:t>。这些检验支持给定时段内的计算结果，无法单独说明三体系统的长期运动。</w:t>
+        <w:t>。这些检验给出了本算例在 T=30 内的数值精度依据；延长轨迹另用步长减半检查。</w:t>
       </w:r>
     </w:p>
     <w:p>
@@ -3564,7 +3564,7 @@
           <w:rFonts w:ascii="Times New Roman" w:hAnsi="Times New Roman" w:eastAsia="宋体"/>
           <w:sz w:val="24"/>
         </w:rPr>
-        <w:t>，并按本文的物体编号重排。表中的小数来自该示例，不能直接写成 Moore 论文给出的初值。</w:t>
+        <w:t>，并按本文的物体编号重排。表中的小数明确标注为该示例提供的初值。</w:t>
       </w:r>
     </w:p>
     <w:p>
@@ -4557,7 +4557,7 @@
           <w:rFonts w:ascii="Times New Roman" w:hAnsi="Times New Roman" w:eastAsia="宋体"/>
           <w:sz w:val="24"/>
         </w:rPr>
-        <w:t>步长减小时，RK4 与 DOP853 的参考差持续下降，周期闭合残差却停在约 3.90×10⁻⁸。DOP853 自身的一周期闭合残差也约为 3.90×10⁻⁸，说明这一平台与初值及周期的小数截断相符，不能据此判断 RK4 不收敛。每周期 600 步时的闭合残差虽偶然较小，参考差并未同步达到最小。</w:t>
+        <w:t>步长减小时，RK4 与 DOP853 的参考差持续下降，周期闭合残差却停在约 3.90×10⁻⁸。DOP853 自身的一周期闭合残差也约为 3.90×10⁻⁸，说明这一平台与初值及周期的小数截断相符，RK4 的参考差则持续收敛。每周期 600 步时的闭合残差虽偶然较小，参考差并未同步达到最小。</w:t>
       </w:r>
     </w:p>
     <w:p>
@@ -4673,7 +4673,7 @@
           <w:rFonts w:ascii="Times New Roman" w:hAnsi="Times New Roman" w:eastAsia="宋体"/>
           <w:sz w:val="24"/>
         </w:rPr>
-        <w:t>图 3-2 给出积分误差、周期闭合残差和局部相位投影。相位投影把位置误差分解到参考速度方向，只用来区分沿轨道与横向的偏离，不是对全局相位的精确重建。积分 20 周期后仍呈八字形，也不能据此断言轨道在无限时间内稳定；相关的存在性证明和稳定性分析见文献</w:t>
+        <w:t>图 3-2 给出积分误差、周期闭合残差和局部相位投影。相位投影把位置误差分解到参考速度方向，只用来区分沿轨道与横向的偏离，不是对全局相位的精确重建。本文报告 20 周期轨迹与误差；轨道存在性和局部稳定性的理论分析见文献</w:t>
       </w:r>
       <w:r>
         <w:rPr>

</xml_diff>